<commit_message>
Enhance Situated Learning proposal with PoC results and structured tables.
Add clearer 3Vs framing, architecture/tool mapping, measured lab outcomes, timeline status, and risk mitigations.

Co-authored-by: Cursor <cursoragent@cursor.com>
</commit_message>
<xml_diff>
--- a/DEVATA_SAI_HARSHITH_2024DC04035_Proposal.docx
+++ b/DEVATA_SAI_HARSHITH_2024DC04035_Proposal.docx
@@ -4,13 +4,14 @@
   <w:body>
     <w:p>
       <w:pPr>
-        <w:spacing w:after="40" w:before="0" w:line="276" w:lineRule="auto"/>
+        <w:spacing w:after="20" w:before="0" w:line="276" w:lineRule="auto"/>
         <w:jc w:val="center"/>
       </w:pPr>
       <w:r>
         <w:rPr>
           <w:rFonts w:ascii="Times New Roman" w:hAnsi="Times New Roman" w:eastAsia="Times New Roman"/>
           <w:b/>
+          <w:i w:val="0"/>
           <w:sz w:val="24"/>
         </w:rPr>
         <w:t>Birla Institute of Technology &amp; Science, Pilani</w:t>
@@ -18,13 +19,14 @@
     </w:p>
     <w:p>
       <w:pPr>
-        <w:spacing w:after="40" w:before="0" w:line="276" w:lineRule="auto"/>
+        <w:spacing w:after="20" w:before="0" w:line="276" w:lineRule="auto"/>
         <w:jc w:val="center"/>
       </w:pPr>
       <w:r>
         <w:rPr>
           <w:rFonts w:ascii="Times New Roman" w:hAnsi="Times New Roman" w:eastAsia="Times New Roman"/>
           <w:b w:val="0"/>
+          <w:i w:val="0"/>
           <w:sz w:val="22"/>
         </w:rPr>
         <w:t>Work Integrated Learning Programmes</w:t>
@@ -32,16 +34,32 @@
     </w:p>
     <w:p>
       <w:pPr>
-        <w:spacing w:after="40" w:before="0" w:line="276" w:lineRule="auto"/>
+        <w:spacing w:after="20" w:before="0" w:line="276" w:lineRule="auto"/>
         <w:jc w:val="center"/>
       </w:pPr>
       <w:r>
         <w:rPr>
           <w:rFonts w:ascii="Times New Roman" w:hAnsi="Times New Roman" w:eastAsia="Times New Roman"/>
           <w:b w:val="0"/>
+          <w:i w:val="0"/>
           <w:sz w:val="22"/>
         </w:rPr>
         <w:t>Department of Computer Science and Information Technology</w:t>
+      </w:r>
+    </w:p>
+    <w:p>
+      <w:pPr>
+        <w:spacing w:after="120" w:before="0" w:line="276" w:lineRule="auto"/>
+        <w:jc w:val="center"/>
+      </w:pPr>
+      <w:r>
+        <w:rPr>
+          <w:rFonts w:ascii="Times New Roman" w:hAnsi="Times New Roman" w:eastAsia="Times New Roman"/>
+          <w:b/>
+          <w:i w:val="0"/>
+          <w:sz w:val="22"/>
+        </w:rPr>
+        <w:t>Big Data Systems (CC ZG522) - Situated Learning</w:t>
       </w:r>
     </w:p>
     <w:p>
@@ -53,23 +71,38 @@
         <w:rPr>
           <w:rFonts w:ascii="Times New Roman" w:hAnsi="Times New Roman" w:eastAsia="Times New Roman"/>
           <w:b/>
-          <w:sz w:val="22"/>
+          <w:i w:val="0"/>
+          <w:sz w:val="28"/>
         </w:rPr>
-        <w:t>Big Data Systems (CC ZG522) — Situated Learning</w:t>
+        <w:t>PROJECT PROPOSAL</w:t>
       </w:r>
     </w:p>
     <w:p>
       <w:pPr>
-        <w:spacing w:after="200" w:before="0" w:line="276" w:lineRule="auto"/>
-        <w:jc w:val="center"/>
+        <w:spacing w:after="20" w:before="0" w:line="276" w:lineRule="auto"/>
       </w:pPr>
       <w:r>
         <w:rPr>
           <w:rFonts w:ascii="Times New Roman" w:hAnsi="Times New Roman" w:eastAsia="Times New Roman"/>
-          <w:b/>
-          <w:sz w:val="28"/>
+          <w:b w:val="0"/>
+          <w:i w:val="0"/>
+          <w:sz w:val="22"/>
         </w:rPr>
-        <w:t>PROJECT PROPOSAL</w:t>
+        <w:t>Student Name: DEVATA SAI HARSHITH</w:t>
+      </w:r>
+    </w:p>
+    <w:p>
+      <w:pPr>
+        <w:spacing w:after="20" w:before="0" w:line="276" w:lineRule="auto"/>
+      </w:pPr>
+      <w:r>
+        <w:rPr>
+          <w:rFonts w:ascii="Times New Roman" w:hAnsi="Times New Roman" w:eastAsia="Times New Roman"/>
+          <w:b w:val="0"/>
+          <w:i w:val="0"/>
+          <w:sz w:val="22"/>
+        </w:rPr>
+        <w:t>BITS ID: 2024DC04035</w:t>
       </w:r>
     </w:p>
     <w:p>
@@ -79,23 +112,11 @@
       <w:r>
         <w:rPr>
           <w:rFonts w:ascii="Times New Roman" w:hAnsi="Times New Roman" w:eastAsia="Times New Roman"/>
-          <w:b w:val="0"/>
+          <w:b/>
+          <w:i w:val="0"/>
           <w:sz w:val="22"/>
         </w:rPr>
-        <w:t>Student Name: DEVATA SAI HARSHITH</w:t>
-      </w:r>
-    </w:p>
-    <w:p>
-      <w:pPr>
-        <w:spacing w:after="40" w:before="0" w:line="276" w:lineRule="auto"/>
-      </w:pPr>
-      <w:r>
-        <w:rPr>
-          <w:rFonts w:ascii="Times New Roman" w:hAnsi="Times New Roman" w:eastAsia="Times New Roman"/>
-          <w:b w:val="0"/>
-          <w:sz w:val="22"/>
-        </w:rPr>
-        <w:t>BITS ID: 2024DC04035</w:t>
+        <w:t>Title: Scalable Big Data Pipeline for AI-Based Benefits Contract Extraction and Excel Template Population</w:t>
       </w:r>
     </w:p>
     <w:p>
@@ -105,10 +126,11 @@
       <w:r>
         <w:rPr>
           <w:rFonts w:ascii="Times New Roman" w:hAnsi="Times New Roman" w:eastAsia="Times New Roman"/>
-          <w:b/>
-          <w:sz w:val="22"/>
+          <w:b w:val="0"/>
+          <w:i/>
+          <w:sz w:val="20"/>
         </w:rPr>
-        <w:t>Title: Scalable Big Data Pipeline for AI-Based Benefits Contract Extraction and Excel Template Population</w:t>
+        <w:t>Keywords: HDFS, Apache Spark, Apache Hive, Generative AI, Contract Intelligence, Data Quality</w:t>
       </w:r>
     </w:p>
     <w:p>
@@ -119,9 +141,232 @@
         <w:rPr>
           <w:rFonts w:ascii="Times New Roman" w:hAnsi="Times New Roman" w:eastAsia="Times New Roman"/>
           <w:b/>
-          <w:sz w:val="26"/>
+          <w:i w:val="0"/>
+          <w:sz w:val="24"/>
         </w:rPr>
         <w:t>1. Problem Statement and Business Context</w:t>
+      </w:r>
+    </w:p>
+    <w:p>
+      <w:pPr>
+        <w:spacing w:after="100" w:before="0" w:line="276" w:lineRule="auto"/>
+        <w:jc w:val="both"/>
+      </w:pPr>
+      <w:r>
+        <w:rPr>
+          <w:rFonts w:ascii="Times New Roman" w:hAnsi="Times New Roman" w:eastAsia="Times New Roman"/>
+          <w:b w:val="0"/>
+          <w:i w:val="0"/>
+          <w:sz w:val="22"/>
+        </w:rPr>
+        <w:t>In my current professional role building Generative AI solutions, I design and operate an AI extraction pipeline that reads benefits-plan contracts (PDF and DOCX), extracts structured commercial and coverage fields, and maps those fields into a standardized Excel template used by business and operations teams. This workflow already delivers business value for limited batches, but it is essentially a document-intelligence process sitting on top of fragile, ad-hoc storage and scripting.</w:t>
+      </w:r>
+    </w:p>
+    <w:p>
+      <w:pPr>
+        <w:spacing w:after="100" w:before="0" w:line="276" w:lineRule="auto"/>
+        <w:jc w:val="both"/>
+      </w:pPr>
+      <w:r>
+        <w:rPr>
+          <w:rFonts w:ascii="Times New Roman" w:hAnsi="Times New Roman" w:eastAsia="Times New Roman"/>
+          <w:b w:val="0"/>
+          <w:i w:val="0"/>
+          <w:sz w:val="22"/>
+        </w:rPr>
+        <w:t>As contract intake grows, the bottleneck is no longer only model accuracy. It becomes a Big Data systems problem: durable multi-format ingest, immutable raw retention for audit and reprocessing, schema validation at scale, quarantine of partial extractions, and measurable operational analytics (success rate, missing-field rate, PDF vs DOCX quality). The Situated Learning project therefore designs and demonstrates a Hadoop-ecosystem backbone around the existing Gen AI extraction step, while using only synthetic sample contracts for academic confidentiality.</w:t>
+      </w:r>
+    </w:p>
+    <w:p>
+      <w:pPr>
+        <w:spacing w:after="40" w:before="0" w:line="276" w:lineRule="auto"/>
+      </w:pPr>
+      <w:r>
+        <w:rPr>
+          <w:rFonts w:ascii="Times New Roman" w:hAnsi="Times New Roman" w:eastAsia="Times New Roman"/>
+          <w:b/>
+          <w:i w:val="0"/>
+          <w:sz w:val="22"/>
+        </w:rPr>
+        <w:t>Business pain points addressed:</w:t>
+      </w:r>
+    </w:p>
+    <w:p>
+      <w:pPr>
+        <w:pStyle w:val="ListBullet"/>
+        <w:spacing w:after="40" w:line="264" w:lineRule="auto"/>
+      </w:pPr>
+      <w:r>
+        <w:rPr>
+          <w:rFonts w:ascii="Times New Roman" w:hAnsi="Times New Roman" w:eastAsia="Times New Roman"/>
+          <w:b w:val="0"/>
+          <w:i w:val="0"/>
+          <w:sz w:val="21"/>
+        </w:rPr>
+        <w:t>No reliable raw zone: contract files and extraction JSON are hard to reprocess after model/template changes.</w:t>
+      </w:r>
+    </w:p>
+    <w:p>
+      <w:pPr>
+        <w:pStyle w:val="ListBullet"/>
+        <w:spacing w:after="40" w:line="264" w:lineRule="auto"/>
+      </w:pPr>
+      <w:r>
+        <w:rPr>
+          <w:rFonts w:ascii="Times New Roman" w:hAnsi="Times New Roman" w:eastAsia="Times New Roman"/>
+          <w:b w:val="0"/>
+          <w:i w:val="0"/>
+          <w:sz w:val="21"/>
+        </w:rPr>
+        <w:t>Weak validation: missing fields can silently reach Excel and pollute downstream decisions.</w:t>
+      </w:r>
+    </w:p>
+    <w:p>
+      <w:pPr>
+        <w:pStyle w:val="ListBullet"/>
+        <w:spacing w:after="40" w:line="264" w:lineRule="auto"/>
+      </w:pPr>
+      <w:r>
+        <w:rPr>
+          <w:rFonts w:ascii="Times New Roman" w:hAnsi="Times New Roman" w:eastAsia="Times New Roman"/>
+          <w:b w:val="0"/>
+          <w:i w:val="0"/>
+          <w:sz w:val="21"/>
+        </w:rPr>
+        <w:t>Limited observability: teams lack SQL-friendly KPIs on throughput, format mix, and quarantine volume.</w:t>
+      </w:r>
+    </w:p>
+    <w:p>
+      <w:pPr>
+        <w:pStyle w:val="ListBullet"/>
+        <w:spacing w:after="40" w:line="264" w:lineRule="auto"/>
+      </w:pPr>
+      <w:r>
+        <w:rPr>
+          <w:rFonts w:ascii="Times New Roman" w:hAnsi="Times New Roman" w:eastAsia="Times New Roman"/>
+          <w:b w:val="0"/>
+          <w:i w:val="0"/>
+          <w:sz w:val="21"/>
+        </w:rPr>
+        <w:t>Tooling gap: Gen AI skills are strong, but the course requires translating the problem into HDFS/Spark/Hive.</w:t>
+      </w:r>
+    </w:p>
+    <w:p>
+      <w:pPr>
+        <w:spacing w:after="40" w:before="80" w:line="276" w:lineRule="auto"/>
+      </w:pPr>
+      <w:r>
+        <w:rPr>
+          <w:rFonts w:ascii="Times New Roman" w:hAnsi="Times New Roman" w:eastAsia="Times New Roman"/>
+          <w:b/>
+          <w:i w:val="0"/>
+          <w:sz w:val="22"/>
+        </w:rPr>
+        <w:t>Objectives:</w:t>
+      </w:r>
+    </w:p>
+    <w:p>
+      <w:pPr>
+        <w:pStyle w:val="ListBullet"/>
+        <w:spacing w:after="40" w:line="264" w:lineRule="auto"/>
+      </w:pPr>
+      <w:r>
+        <w:rPr>
+          <w:rFonts w:ascii="Times New Roman" w:hAnsi="Times New Roman" w:eastAsia="Times New Roman"/>
+          <w:b w:val="0"/>
+          <w:i w:val="0"/>
+          <w:sz w:val="21"/>
+        </w:rPr>
+        <w:t>Design a layered lakehouse-style architecture (raw -&gt; extracted -&gt; curated/quarantine) on HDFS.</w:t>
+      </w:r>
+    </w:p>
+    <w:p>
+      <w:pPr>
+        <w:pStyle w:val="ListBullet"/>
+        <w:spacing w:after="40" w:line="264" w:lineRule="auto"/>
+      </w:pPr>
+      <w:r>
+        <w:rPr>
+          <w:rFonts w:ascii="Times New Roman" w:hAnsi="Times New Roman" w:eastAsia="Times New Roman"/>
+          <w:b w:val="0"/>
+          <w:i w:val="0"/>
+          <w:sz w:val="21"/>
+        </w:rPr>
+        <w:t>Implement a working PoC using at least three Hadoop tools: HDFS, Spark, and Hive.</w:t>
+      </w:r>
+    </w:p>
+    <w:p>
+      <w:pPr>
+        <w:pStyle w:val="ListBullet"/>
+        <w:spacing w:after="40" w:line="264" w:lineRule="auto"/>
+      </w:pPr>
+      <w:r>
+        <w:rPr>
+          <w:rFonts w:ascii="Times New Roman" w:hAnsi="Times New Roman" w:eastAsia="Times New Roman"/>
+          <w:b w:val="0"/>
+          <w:i w:val="0"/>
+          <w:sz w:val="21"/>
+        </w:rPr>
+        <w:t>Validate required extraction fields, quarantine incomplete records, and populate an Excel template.</w:t>
+      </w:r>
+    </w:p>
+    <w:p>
+      <w:pPr>
+        <w:pStyle w:val="ListBullet"/>
+        <w:spacing w:after="40" w:line="264" w:lineRule="auto"/>
+      </w:pPr>
+      <w:r>
+        <w:rPr>
+          <w:rFonts w:ascii="Times New Roman" w:hAnsi="Times New Roman" w:eastAsia="Times New Roman"/>
+          <w:b w:val="0"/>
+          <w:i w:val="0"/>
+          <w:sz w:val="21"/>
+        </w:rPr>
+        <w:t>Produce preliminary insights (success rate, format split, region/plan distribution) with screenshots.</w:t>
+      </w:r>
+    </w:p>
+    <w:p>
+      <w:pPr>
+        <w:spacing w:after="80" w:before="200" w:line="276" w:lineRule="auto"/>
+      </w:pPr>
+      <w:r>
+        <w:rPr>
+          <w:rFonts w:ascii="Times New Roman" w:hAnsi="Times New Roman" w:eastAsia="Times New Roman"/>
+          <w:b/>
+          <w:i w:val="0"/>
+          <w:sz w:val="24"/>
+        </w:rPr>
+        <w:t>2. Why This Is a Big Data Problem (3Vs)</w:t>
+      </w:r>
+    </w:p>
+    <w:p>
+      <w:pPr>
+        <w:spacing w:after="80" w:before="0" w:line="276" w:lineRule="auto"/>
+        <w:jc w:val="both"/>
+      </w:pPr>
+      <w:r>
+        <w:rPr>
+          <w:rFonts w:ascii="Times New Roman" w:hAnsi="Times New Roman" w:eastAsia="Times New Roman"/>
+          <w:b w:val="0"/>
+          <w:i w:val="0"/>
+          <w:sz w:val="22"/>
+        </w:rPr>
+        <w:t>Volume: Contract libraries grow to thousands of multi-page documents. Each file expands into large text payloads plus nested JSON extraction records. Over months, raw files, run versions, curated Parquet, and logs accumulate to multi-GB/TB scale if productionized.</w:t>
+      </w:r>
+    </w:p>
+    <w:p>
+      <w:pPr>
+        <w:spacing w:after="80" w:before="0" w:line="276" w:lineRule="auto"/>
+        <w:jc w:val="both"/>
+      </w:pPr>
+      <w:r>
+        <w:rPr>
+          <w:rFonts w:ascii="Times New Roman" w:hAnsi="Times New Roman" w:eastAsia="Times New Roman"/>
+          <w:b w:val="0"/>
+          <w:i w:val="0"/>
+          <w:sz w:val="22"/>
+        </w:rPr>
+        <w:t>Velocity: Renewals, amendments, and new employer groups arrive continuously. Model upgrades or Excel schema changes force bursty historical reprocessing, stressing both compute (Spark) and storage (HDFS).</w:t>
       </w:r>
     </w:p>
     <w:p>
@@ -133,161 +378,10 @@
         <w:rPr>
           <w:rFonts w:ascii="Times New Roman" w:hAnsi="Times New Roman" w:eastAsia="Times New Roman"/>
           <w:b w:val="0"/>
+          <w:i w:val="0"/>
           <w:sz w:val="22"/>
         </w:rPr>
-        <w:t>In my current work role focused on Generative AI solutions, I build and operate an AI pipeline that reads benefits/LifeSource-style contracts and extracts structured commercial and plan information. Downstream code then maps the extracted fields into a standardized Excel template used by business and operations teams.</w:t>
-      </w:r>
-    </w:p>
-    <w:p>
-      <w:pPr>
-        <w:spacing w:after="120" w:before="0" w:line="276" w:lineRule="auto"/>
-        <w:jc w:val="both"/>
-      </w:pPr>
-      <w:r>
-        <w:rPr>
-          <w:rFonts w:ascii="Times New Roman" w:hAnsi="Times New Roman" w:eastAsia="Times New Roman"/>
-          <w:b w:val="0"/>
-          <w:sz w:val="22"/>
-        </w:rPr>
-        <w:t>Today this works for limited volumes, but as PDF/DOCX contract intake grows, the end-to-end flow becomes a data engineering challenge: reliable batch ingest of heterogeneous documents, durable storage of raw and intermediate artifacts, scalable validation/mapping of extraction outputs, auditability of runs, and measurable quality/throughput reporting. The Situated Learning project designs a Big Data solution around this real workflow using Hadoop ecosystem tools, while keeping client confidentiality by using only synthetic sample contracts for the PoC.</w:t>
-      </w:r>
-    </w:p>
-    <w:p>
-      <w:pPr>
-        <w:spacing w:after="40" w:before="0" w:line="276" w:lineRule="auto"/>
-      </w:pPr>
-      <w:r>
-        <w:rPr>
-          <w:rFonts w:ascii="Times New Roman" w:hAnsi="Times New Roman" w:eastAsia="Times New Roman"/>
-          <w:b/>
-          <w:sz w:val="22"/>
-        </w:rPr>
-        <w:t>Specific challenge:</w:t>
-      </w:r>
-    </w:p>
-    <w:p>
-      <w:pPr>
-        <w:pStyle w:val="ListBullet"/>
-        <w:spacing w:after="40" w:line="264" w:lineRule="auto"/>
-      </w:pPr>
-      <w:r>
-        <w:rPr>
-          <w:rFonts w:ascii="Times New Roman" w:hAnsi="Times New Roman" w:eastAsia="Times New Roman"/>
-          <w:b w:val="0"/>
-          <w:sz w:val="22"/>
-        </w:rPr>
-        <w:t>Ingest mixed-format contracts (PDF and DOCX) continuously or in batches.</w:t>
-      </w:r>
-    </w:p>
-    <w:p>
-      <w:pPr>
-        <w:pStyle w:val="ListBullet"/>
-        <w:spacing w:after="40" w:line="264" w:lineRule="auto"/>
-      </w:pPr>
-      <w:r>
-        <w:rPr>
-          <w:rFonts w:ascii="Times New Roman" w:hAnsi="Times New Roman" w:eastAsia="Times New Roman"/>
-          <w:b w:val="0"/>
-          <w:sz w:val="22"/>
-        </w:rPr>
-        <w:t>Persist raw files and AI extraction JSON for reprocessing and audit.</w:t>
-      </w:r>
-    </w:p>
-    <w:p>
-      <w:pPr>
-        <w:pStyle w:val="ListBullet"/>
-        <w:spacing w:after="40" w:line="264" w:lineRule="auto"/>
-      </w:pPr>
-      <w:r>
-        <w:rPr>
-          <w:rFonts w:ascii="Times New Roman" w:hAnsi="Times New Roman" w:eastAsia="Times New Roman"/>
-          <w:b w:val="0"/>
-          <w:sz w:val="22"/>
-        </w:rPr>
-        <w:t>Validate required fields and map them into a fixed Excel template schema.</w:t>
-      </w:r>
-    </w:p>
-    <w:p>
-      <w:pPr>
-        <w:pStyle w:val="ListBullet"/>
-        <w:spacing w:after="40" w:line="264" w:lineRule="auto"/>
-      </w:pPr>
-      <w:r>
-        <w:rPr>
-          <w:rFonts w:ascii="Times New Roman" w:hAnsi="Times New Roman" w:eastAsia="Times New Roman"/>
-          <w:b w:val="0"/>
-          <w:sz w:val="22"/>
-        </w:rPr>
-        <w:t>Produce operational insights: success/failure rates, missing-field rates, processing latency.</w:t>
-      </w:r>
-    </w:p>
-    <w:p>
-      <w:pPr>
-        <w:spacing w:after="40" w:before="80" w:line="276" w:lineRule="auto"/>
-      </w:pPr>
-      <w:r>
-        <w:rPr>
-          <w:rFonts w:ascii="Times New Roman" w:hAnsi="Times New Roman" w:eastAsia="Times New Roman"/>
-          <w:b/>
-          <w:sz w:val="22"/>
-        </w:rPr>
-        <w:t>Objectives and expected outcomes:</w:t>
-      </w:r>
-    </w:p>
-    <w:p>
-      <w:pPr>
-        <w:pStyle w:val="ListBullet"/>
-        <w:spacing w:after="40" w:line="264" w:lineRule="auto"/>
-      </w:pPr>
-      <w:r>
-        <w:rPr>
-          <w:rFonts w:ascii="Times New Roman" w:hAnsi="Times New Roman" w:eastAsia="Times New Roman"/>
-          <w:b w:val="0"/>
-          <w:sz w:val="22"/>
-        </w:rPr>
-        <w:t>Design a layered architecture (raw → processed → curated) on HDFS.</w:t>
-      </w:r>
-    </w:p>
-    <w:p>
-      <w:pPr>
-        <w:pStyle w:val="ListBullet"/>
-        <w:spacing w:after="40" w:line="264" w:lineRule="auto"/>
-      </w:pPr>
-      <w:r>
-        <w:rPr>
-          <w:rFonts w:ascii="Times New Roman" w:hAnsi="Times New Roman" w:eastAsia="Times New Roman"/>
-          <w:b w:val="0"/>
-          <w:sz w:val="22"/>
-        </w:rPr>
-        <w:t>Implement a small but meaningful PoC with at least three Hadoop tools.</w:t>
-      </w:r>
-    </w:p>
-    <w:p>
-      <w:pPr>
-        <w:pStyle w:val="ListBullet"/>
-        <w:spacing w:after="40" w:line="264" w:lineRule="auto"/>
-      </w:pPr>
-      <w:r>
-        <w:rPr>
-          <w:rFonts w:ascii="Times New Roman" w:hAnsi="Times New Roman" w:eastAsia="Times New Roman"/>
-          <w:b w:val="0"/>
-          <w:sz w:val="22"/>
-        </w:rPr>
-        <w:t>Demonstrate extraction-result validation, Excel population, and basic analytics.</w:t>
-      </w:r>
-    </w:p>
-    <w:p>
-      <w:pPr>
-        <w:pStyle w:val="ListBullet"/>
-        <w:spacing w:after="40" w:line="264" w:lineRule="auto"/>
-      </w:pPr>
-      <w:r>
-        <w:rPr>
-          <w:rFonts w:ascii="Times New Roman" w:hAnsi="Times New Roman" w:eastAsia="Times New Roman"/>
-          <w:b w:val="0"/>
-          <w:sz w:val="22"/>
-        </w:rPr>
-        <w:t>Show a path from PoC to production-scale contract processing.</w:t>
+        <w:t>Variety: Inputs are heterogeneous PDF and DOCX layouts (tables, schedules, free-text clauses). Intermediate outputs are semi-structured JSON; curated outputs are columnar Parquet/CSV; business delivery remains Excel. This multi-modal pipeline is a classic Variety challenge for the Hadoop stack.</w:t>
       </w:r>
     </w:p>
     <w:p>
@@ -298,62 +392,8 @@
         <w:rPr>
           <w:rFonts w:ascii="Times New Roman" w:hAnsi="Times New Roman" w:eastAsia="Times New Roman"/>
           <w:b/>
-          <w:sz w:val="26"/>
-        </w:rPr>
-        <w:t>2. Why This Is a Big Data Problem</w:t>
-      </w:r>
-    </w:p>
-    <w:p>
-      <w:pPr>
-        <w:spacing w:after="80" w:before="0" w:line="276" w:lineRule="auto"/>
-        <w:jc w:val="both"/>
-      </w:pPr>
-      <w:r>
-        <w:rPr>
-          <w:rFonts w:ascii="Times New Roman" w:hAnsi="Times New Roman" w:eastAsia="Times New Roman"/>
-          <w:b w:val="0"/>
-          <w:sz w:val="22"/>
-        </w:rPr>
-        <w:t>Volume: Contract repositories grow to thousands of multi-page documents; each document yields large text payloads and nested JSON extraction records. Over time, raw files, versions, and run logs accumulate to multi-GB/TB scale.</w:t>
-      </w:r>
-    </w:p>
-    <w:p>
-      <w:pPr>
-        <w:spacing w:after="80" w:before="0" w:line="276" w:lineRule="auto"/>
-        <w:jc w:val="both"/>
-      </w:pPr>
-      <w:r>
-        <w:rPr>
-          <w:rFonts w:ascii="Times New Roman" w:hAnsi="Times New Roman" w:eastAsia="Times New Roman"/>
-          <w:b w:val="0"/>
-          <w:sz w:val="22"/>
-        </w:rPr>
-        <w:t>Velocity: New contracts, renewals, and amendments arrive regularly. Model or template changes force reprocessing of historical batches, creating bursty compute and write workloads.</w:t>
-      </w:r>
-    </w:p>
-    <w:p>
-      <w:pPr>
-        <w:spacing w:after="120" w:before="0" w:line="276" w:lineRule="auto"/>
-        <w:jc w:val="both"/>
-      </w:pPr>
-      <w:r>
-        <w:rPr>
-          <w:rFonts w:ascii="Times New Roman" w:hAnsi="Times New Roman" w:eastAsia="Times New Roman"/>
-          <w:b w:val="0"/>
-          <w:sz w:val="22"/>
-        </w:rPr>
-        <w:t>Variety: Sources include PDF and DOCX (native and scanned), with inconsistent layouts, tables, schedules, and clause structures. Outputs include unstructured text, semi-structured JSON, and structured Excel templates.</w:t>
-      </w:r>
-    </w:p>
-    <w:p>
-      <w:pPr>
-        <w:spacing w:after="80" w:before="200" w:line="276" w:lineRule="auto"/>
-      </w:pPr>
-      <w:r>
-        <w:rPr>
-          <w:rFonts w:ascii="Times New Roman" w:hAnsi="Times New Roman" w:eastAsia="Times New Roman"/>
-          <w:b/>
-          <w:sz w:val="26"/>
+          <w:i w:val="0"/>
+          <w:sz w:val="24"/>
         </w:rPr>
         <w:t>3. Data Landscape</w:t>
       </w:r>
@@ -367,22 +407,499 @@
         <w:rPr>
           <w:rFonts w:ascii="Times New Roman" w:hAnsi="Times New Roman" w:eastAsia="Times New Roman"/>
           <w:b w:val="0"/>
+          <w:i w:val="0"/>
           <w:sz w:val="22"/>
         </w:rPr>
-        <w:t>Production data cannot be used or duplicated for academic submission due to confidentiality. The PoC therefore uses synthetic contracts that mimic the field structure of benefits contracts (parties, effective dates, plan codes, coverage limits, networks, etc.) without copying any real client content.</w:t>
+        <w:t>Production client contracts cannot be used or duplicated for this academic submission. The PoC therefore uses fully synthetic agreements that preserve realistic field structure (parties, dates, plan type, network, limits, broker, status) without any confidential wording.</w:t>
       </w:r>
+    </w:p>
+    <w:tbl>
+      <w:tblPr>
+        <w:tblStyle w:val="TableGrid"/>
+        <w:tblW w:type="auto" w:w="0"/>
+        <w:jc w:val="center"/>
+        <w:tblLook w:firstColumn="1" w:firstRow="1" w:lastColumn="0" w:lastRow="0" w:noHBand="0" w:noVBand="1" w:val="04A0"/>
+      </w:tblPr>
+      <w:tblGrid>
+        <w:gridCol w:w="2448"/>
+        <w:gridCol w:w="2448"/>
+        <w:gridCol w:w="2448"/>
+        <w:gridCol w:w="2448"/>
+      </w:tblGrid>
+      <w:tr>
+        <w:tc>
+          <w:tcPr>
+            <w:tcW w:type="dxa" w:w="1728"/>
+            <w:shd w:fill="1F4E79"/>
+          </w:tcPr>
+          <w:p>
+            <w:r>
+              <w:rPr>
+                <w:rFonts w:ascii="Times New Roman" w:hAnsi="Times New Roman"/>
+                <w:b/>
+                <w:color w:val="FFFFFF"/>
+                <w:sz w:val="20"/>
+              </w:rPr>
+            </w:r>
+            <w:r>
+              <w:rPr>
+                <w:rFonts w:ascii="Times New Roman" w:hAnsi="Times New Roman" w:eastAsia="Times New Roman"/>
+                <w:b/>
+                <w:i w:val="0"/>
+                <w:color w:val="FFFFFF"/>
+                <w:sz w:val="20"/>
+              </w:rPr>
+              <w:t>Layer</w:t>
+            </w:r>
+          </w:p>
+        </w:tc>
+        <w:tc>
+          <w:tcPr>
+            <w:tcW w:type="dxa" w:w="3744"/>
+            <w:shd w:fill="1F4E79"/>
+          </w:tcPr>
+          <w:p>
+            <w:r>
+              <w:rPr>
+                <w:rFonts w:ascii="Times New Roman" w:hAnsi="Times New Roman"/>
+                <w:b/>
+                <w:color w:val="FFFFFF"/>
+                <w:sz w:val="20"/>
+              </w:rPr>
+            </w:r>
+            <w:r>
+              <w:rPr>
+                <w:rFonts w:ascii="Times New Roman" w:hAnsi="Times New Roman" w:eastAsia="Times New Roman"/>
+                <w:b/>
+                <w:i w:val="0"/>
+                <w:color w:val="FFFFFF"/>
+                <w:sz w:val="20"/>
+              </w:rPr>
+              <w:t>Content</w:t>
+            </w:r>
+          </w:p>
+        </w:tc>
+        <w:tc>
+          <w:tcPr>
+            <w:tcW w:type="dxa" w:w="2304"/>
+            <w:shd w:fill="1F4E79"/>
+          </w:tcPr>
+          <w:p>
+            <w:r>
+              <w:rPr>
+                <w:rFonts w:ascii="Times New Roman" w:hAnsi="Times New Roman"/>
+                <w:b/>
+                <w:color w:val="FFFFFF"/>
+                <w:sz w:val="20"/>
+              </w:rPr>
+            </w:r>
+            <w:r>
+              <w:rPr>
+                <w:rFonts w:ascii="Times New Roman" w:hAnsi="Times New Roman" w:eastAsia="Times New Roman"/>
+                <w:b/>
+                <w:i w:val="0"/>
+                <w:color w:val="FFFFFF"/>
+                <w:sz w:val="20"/>
+              </w:rPr>
+              <w:t>Format</w:t>
+            </w:r>
+          </w:p>
+        </w:tc>
+        <w:tc>
+          <w:tcPr>
+            <w:tcW w:type="dxa" w:w="2304"/>
+            <w:shd w:fill="1F4E79"/>
+          </w:tcPr>
+          <w:p>
+            <w:r>
+              <w:rPr>
+                <w:rFonts w:ascii="Times New Roman" w:hAnsi="Times New Roman"/>
+                <w:b/>
+                <w:color w:val="FFFFFF"/>
+                <w:sz w:val="20"/>
+              </w:rPr>
+            </w:r>
+            <w:r>
+              <w:rPr>
+                <w:rFonts w:ascii="Times New Roman" w:hAnsi="Times New Roman" w:eastAsia="Times New Roman"/>
+                <w:b/>
+                <w:i w:val="0"/>
+                <w:color w:val="FFFFFF"/>
+                <w:sz w:val="20"/>
+              </w:rPr>
+              <w:t>PoC count</w:t>
+            </w:r>
+          </w:p>
+        </w:tc>
+      </w:tr>
+      <w:tr>
+        <w:tc>
+          <w:tcPr>
+            <w:tcW w:type="dxa" w:w="1728"/>
+          </w:tcPr>
+          <w:p>
+            <w:r/>
+            <w:r>
+              <w:rPr>
+                <w:rFonts w:ascii="Times New Roman" w:hAnsi="Times New Roman" w:eastAsia="Times New Roman"/>
+                <w:b w:val="0"/>
+                <w:i w:val="0"/>
+                <w:sz w:val="20"/>
+              </w:rPr>
+              <w:t>Raw</w:t>
+            </w:r>
+          </w:p>
+        </w:tc>
+        <w:tc>
+          <w:tcPr>
+            <w:tcW w:type="dxa" w:w="3744"/>
+          </w:tcPr>
+          <w:p>
+            <w:r/>
+            <w:r>
+              <w:rPr>
+                <w:rFonts w:ascii="Times New Roman" w:hAnsi="Times New Roman" w:eastAsia="Times New Roman"/>
+                <w:b w:val="0"/>
+                <w:i w:val="0"/>
+                <w:sz w:val="20"/>
+              </w:rPr>
+              <w:t>Synthetic benefits contracts</w:t>
+            </w:r>
+          </w:p>
+        </w:tc>
+        <w:tc>
+          <w:tcPr>
+            <w:tcW w:type="dxa" w:w="2304"/>
+          </w:tcPr>
+          <w:p>
+            <w:r/>
+            <w:r>
+              <w:rPr>
+                <w:rFonts w:ascii="Times New Roman" w:hAnsi="Times New Roman" w:eastAsia="Times New Roman"/>
+                <w:b w:val="0"/>
+                <w:i w:val="0"/>
+                <w:sz w:val="20"/>
+              </w:rPr>
+              <w:t>PDF, DOCX</w:t>
+            </w:r>
+          </w:p>
+        </w:tc>
+        <w:tc>
+          <w:tcPr>
+            <w:tcW w:type="dxa" w:w="2304"/>
+          </w:tcPr>
+          <w:p>
+            <w:r/>
+            <w:r>
+              <w:rPr>
+                <w:rFonts w:ascii="Times New Roman" w:hAnsi="Times New Roman" w:eastAsia="Times New Roman"/>
+                <w:b w:val="0"/>
+                <w:i w:val="0"/>
+                <w:sz w:val="20"/>
+              </w:rPr>
+              <w:t>5 PDF + 5 DOCX</w:t>
+            </w:r>
+          </w:p>
+        </w:tc>
+      </w:tr>
+      <w:tr>
+        <w:tc>
+          <w:tcPr>
+            <w:tcW w:type="dxa" w:w="1728"/>
+          </w:tcPr>
+          <w:p>
+            <w:r/>
+            <w:r>
+              <w:rPr>
+                <w:rFonts w:ascii="Times New Roman" w:hAnsi="Times New Roman" w:eastAsia="Times New Roman"/>
+                <w:b w:val="0"/>
+                <w:i w:val="0"/>
+                <w:sz w:val="20"/>
+              </w:rPr>
+              <w:t>Extracted</w:t>
+            </w:r>
+          </w:p>
+        </w:tc>
+        <w:tc>
+          <w:tcPr>
+            <w:tcW w:type="dxa" w:w="3744"/>
+          </w:tcPr>
+          <w:p>
+            <w:r/>
+            <w:r>
+              <w:rPr>
+                <w:rFonts w:ascii="Times New Roman" w:hAnsi="Times New Roman" w:eastAsia="Times New Roman"/>
+                <w:b w:val="0"/>
+                <w:i w:val="0"/>
+                <w:sz w:val="20"/>
+              </w:rPr>
+              <w:t>Simulated AI extraction payloads</w:t>
+            </w:r>
+          </w:p>
+        </w:tc>
+        <w:tc>
+          <w:tcPr>
+            <w:tcW w:type="dxa" w:w="2304"/>
+          </w:tcPr>
+          <w:p>
+            <w:r/>
+            <w:r>
+              <w:rPr>
+                <w:rFonts w:ascii="Times New Roman" w:hAnsi="Times New Roman" w:eastAsia="Times New Roman"/>
+                <w:b w:val="0"/>
+                <w:i w:val="0"/>
+                <w:sz w:val="20"/>
+              </w:rPr>
+              <w:t>JSON</w:t>
+            </w:r>
+          </w:p>
+        </w:tc>
+        <w:tc>
+          <w:tcPr>
+            <w:tcW w:type="dxa" w:w="2304"/>
+          </w:tcPr>
+          <w:p>
+            <w:r/>
+            <w:r>
+              <w:rPr>
+                <w:rFonts w:ascii="Times New Roman" w:hAnsi="Times New Roman" w:eastAsia="Times New Roman"/>
+                <w:b w:val="0"/>
+                <w:i w:val="0"/>
+                <w:sz w:val="20"/>
+              </w:rPr>
+              <w:t>10 files</w:t>
+            </w:r>
+          </w:p>
+        </w:tc>
+      </w:tr>
+      <w:tr>
+        <w:tc>
+          <w:tcPr>
+            <w:tcW w:type="dxa" w:w="1728"/>
+          </w:tcPr>
+          <w:p>
+            <w:r/>
+            <w:r>
+              <w:rPr>
+                <w:rFonts w:ascii="Times New Roman" w:hAnsi="Times New Roman" w:eastAsia="Times New Roman"/>
+                <w:b w:val="0"/>
+                <w:i w:val="0"/>
+                <w:sz w:val="20"/>
+              </w:rPr>
+              <w:t>Curated</w:t>
+            </w:r>
+          </w:p>
+        </w:tc>
+        <w:tc>
+          <w:tcPr>
+            <w:tcW w:type="dxa" w:w="3744"/>
+          </w:tcPr>
+          <w:p>
+            <w:r/>
+            <w:r>
+              <w:rPr>
+                <w:rFonts w:ascii="Times New Roman" w:hAnsi="Times New Roman" w:eastAsia="Times New Roman"/>
+                <w:b w:val="0"/>
+                <w:i w:val="0"/>
+                <w:sz w:val="20"/>
+              </w:rPr>
+              <w:t>Validated mapped records</w:t>
+            </w:r>
+          </w:p>
+        </w:tc>
+        <w:tc>
+          <w:tcPr>
+            <w:tcW w:type="dxa" w:w="2304"/>
+          </w:tcPr>
+          <w:p>
+            <w:r/>
+            <w:r>
+              <w:rPr>
+                <w:rFonts w:ascii="Times New Roman" w:hAnsi="Times New Roman" w:eastAsia="Times New Roman"/>
+                <w:b w:val="0"/>
+                <w:i w:val="0"/>
+                <w:sz w:val="20"/>
+              </w:rPr>
+              <w:t>Parquet + CSV</w:t>
+            </w:r>
+          </w:p>
+        </w:tc>
+        <w:tc>
+          <w:tcPr>
+            <w:tcW w:type="dxa" w:w="2304"/>
+          </w:tcPr>
+          <w:p>
+            <w:r/>
+            <w:r>
+              <w:rPr>
+                <w:rFonts w:ascii="Times New Roman" w:hAnsi="Times New Roman" w:eastAsia="Times New Roman"/>
+                <w:b w:val="0"/>
+                <w:i w:val="0"/>
+                <w:sz w:val="20"/>
+              </w:rPr>
+              <w:t>9 VALID rows</w:t>
+            </w:r>
+          </w:p>
+        </w:tc>
+      </w:tr>
+      <w:tr>
+        <w:tc>
+          <w:tcPr>
+            <w:tcW w:type="dxa" w:w="1728"/>
+          </w:tcPr>
+          <w:p>
+            <w:r/>
+            <w:r>
+              <w:rPr>
+                <w:rFonts w:ascii="Times New Roman" w:hAnsi="Times New Roman" w:eastAsia="Times New Roman"/>
+                <w:b w:val="0"/>
+                <w:i w:val="0"/>
+                <w:sz w:val="20"/>
+              </w:rPr>
+              <w:t>Quarantine</w:t>
+            </w:r>
+          </w:p>
+        </w:tc>
+        <w:tc>
+          <w:tcPr>
+            <w:tcW w:type="dxa" w:w="3744"/>
+          </w:tcPr>
+          <w:p>
+            <w:r/>
+            <w:r>
+              <w:rPr>
+                <w:rFonts w:ascii="Times New Roman" w:hAnsi="Times New Roman" w:eastAsia="Times New Roman"/>
+                <w:b w:val="0"/>
+                <w:i w:val="0"/>
+                <w:sz w:val="20"/>
+              </w:rPr>
+              <w:t>Failed validation records</w:t>
+            </w:r>
+          </w:p>
+        </w:tc>
+        <w:tc>
+          <w:tcPr>
+            <w:tcW w:type="dxa" w:w="2304"/>
+          </w:tcPr>
+          <w:p>
+            <w:r/>
+            <w:r>
+              <w:rPr>
+                <w:rFonts w:ascii="Times New Roman" w:hAnsi="Times New Roman" w:eastAsia="Times New Roman"/>
+                <w:b w:val="0"/>
+                <w:i w:val="0"/>
+                <w:sz w:val="20"/>
+              </w:rPr>
+              <w:t>CSV</w:t>
+            </w:r>
+          </w:p>
+        </w:tc>
+        <w:tc>
+          <w:tcPr>
+            <w:tcW w:type="dxa" w:w="2304"/>
+          </w:tcPr>
+          <w:p>
+            <w:r/>
+            <w:r>
+              <w:rPr>
+                <w:rFonts w:ascii="Times New Roman" w:hAnsi="Times New Roman" w:eastAsia="Times New Roman"/>
+                <w:b w:val="0"/>
+                <w:i w:val="0"/>
+                <w:sz w:val="20"/>
+              </w:rPr>
+              <w:t>1 INVALID row</w:t>
+            </w:r>
+          </w:p>
+        </w:tc>
+      </w:tr>
+      <w:tr>
+        <w:tc>
+          <w:tcPr>
+            <w:tcW w:type="dxa" w:w="1728"/>
+          </w:tcPr>
+          <w:p>
+            <w:r/>
+            <w:r>
+              <w:rPr>
+                <w:rFonts w:ascii="Times New Roman" w:hAnsi="Times New Roman" w:eastAsia="Times New Roman"/>
+                <w:b w:val="0"/>
+                <w:i w:val="0"/>
+                <w:sz w:val="20"/>
+              </w:rPr>
+              <w:t>Business</w:t>
+            </w:r>
+          </w:p>
+        </w:tc>
+        <w:tc>
+          <w:tcPr>
+            <w:tcW w:type="dxa" w:w="3744"/>
+          </w:tcPr>
+          <w:p>
+            <w:r/>
+            <w:r>
+              <w:rPr>
+                <w:rFonts w:ascii="Times New Roman" w:hAnsi="Times New Roman" w:eastAsia="Times New Roman"/>
+                <w:b w:val="0"/>
+                <w:i w:val="0"/>
+                <w:sz w:val="20"/>
+              </w:rPr>
+              <w:t>Excel extract template / filled export</w:t>
+            </w:r>
+          </w:p>
+        </w:tc>
+        <w:tc>
+          <w:tcPr>
+            <w:tcW w:type="dxa" w:w="2304"/>
+          </w:tcPr>
+          <w:p>
+            <w:r/>
+            <w:r>
+              <w:rPr>
+                <w:rFonts w:ascii="Times New Roman" w:hAnsi="Times New Roman" w:eastAsia="Times New Roman"/>
+                <w:b w:val="0"/>
+                <w:i w:val="0"/>
+                <w:sz w:val="20"/>
+              </w:rPr>
+              <w:t>XLSX</w:t>
+            </w:r>
+          </w:p>
+        </w:tc>
+        <w:tc>
+          <w:tcPr>
+            <w:tcW w:type="dxa" w:w="2304"/>
+          </w:tcPr>
+          <w:p>
+            <w:r/>
+            <w:r>
+              <w:rPr>
+                <w:rFonts w:ascii="Times New Roman" w:hAnsi="Times New Roman" w:eastAsia="Times New Roman"/>
+                <w:b w:val="0"/>
+                <w:i w:val="0"/>
+                <w:sz w:val="20"/>
+              </w:rPr>
+              <w:t>1 template + 1 export</w:t>
+            </w:r>
+          </w:p>
+        </w:tc>
+      </w:tr>
+    </w:tbl>
+    <w:p>
+      <w:pPr>
+        <w:spacing w:after="80"/>
+      </w:pPr>
     </w:p>
     <w:p>
       <w:pPr>
-        <w:spacing w:after="40" w:before="0" w:line="276" w:lineRule="auto"/>
+        <w:spacing w:after="40" w:before="40" w:line="276" w:lineRule="auto"/>
       </w:pPr>
       <w:r>
         <w:rPr>
           <w:rFonts w:ascii="Times New Roman" w:hAnsi="Times New Roman" w:eastAsia="Times New Roman"/>
           <w:b/>
+          <w:i w:val="0"/>
           <w:sz w:val="22"/>
         </w:rPr>
-        <w:t>Data sources (PoC):</w:t>
+        <w:t>Primary extraction schema (mapped to Excel columns):</w:t>
       </w:r>
     </w:p>
     <w:p>
@@ -394,76 +911,8 @@
         <w:rPr>
           <w:rFonts w:ascii="Times New Roman" w:hAnsi="Times New Roman" w:eastAsia="Times New Roman"/>
           <w:b w:val="0"/>
-          <w:sz w:val="22"/>
-        </w:rPr>
-        <w:t>Synthetic PDF contracts (5–15 files) with labeled sections and key-value style clauses.</w:t>
-      </w:r>
-    </w:p>
-    <w:p>
-      <w:pPr>
-        <w:pStyle w:val="ListBullet"/>
-        <w:spacing w:after="40" w:line="264" w:lineRule="auto"/>
-      </w:pPr>
-      <w:r>
-        <w:rPr>
-          <w:rFonts w:ascii="Times New Roman" w:hAnsi="Times New Roman" w:eastAsia="Times New Roman"/>
-          <w:b w:val="0"/>
-          <w:sz w:val="22"/>
-        </w:rPr>
-        <w:t>Synthetic DOCX contracts (5–10 files) with similar extractable fields.</w:t>
-      </w:r>
-    </w:p>
-    <w:p>
-      <w:pPr>
-        <w:pStyle w:val="ListBullet"/>
-        <w:spacing w:after="40" w:line="264" w:lineRule="auto"/>
-      </w:pPr>
-      <w:r>
-        <w:rPr>
-          <w:rFonts w:ascii="Times New Roman" w:hAnsi="Times New Roman" w:eastAsia="Times New Roman"/>
-          <w:b w:val="0"/>
-          <w:sz w:val="22"/>
-        </w:rPr>
-        <w:t>Simulated AI extraction JSON aligned to a predefined field schema.</w:t>
-      </w:r>
-    </w:p>
-    <w:p>
-      <w:pPr>
-        <w:pStyle w:val="ListBullet"/>
-        <w:spacing w:after="40" w:line="264" w:lineRule="auto"/>
-      </w:pPr>
-      <w:r>
-        <w:rPr>
-          <w:rFonts w:ascii="Times New Roman" w:hAnsi="Times New Roman" w:eastAsia="Times New Roman"/>
-          <w:b w:val="0"/>
-          <w:sz w:val="22"/>
-        </w:rPr>
-        <w:t>Excel template (.xlsx) defining the target business columns.</w:t>
-      </w:r>
-    </w:p>
-    <w:p>
-      <w:pPr>
-        <w:spacing w:after="40" w:before="80" w:line="276" w:lineRule="auto"/>
-      </w:pPr>
-      <w:r>
-        <w:rPr>
-          <w:rFonts w:ascii="Times New Roman" w:hAnsi="Times New Roman" w:eastAsia="Times New Roman"/>
-          <w:b/>
-          <w:sz w:val="22"/>
-        </w:rPr>
-        <w:t>Target extraction fields (illustrative):</w:t>
-      </w:r>
-    </w:p>
-    <w:p>
-      <w:pPr>
-        <w:pStyle w:val="ListBullet"/>
-        <w:spacing w:after="40" w:line="264" w:lineRule="auto"/>
-      </w:pPr>
-      <w:r>
-        <w:rPr>
-          <w:rFonts w:ascii="Times New Roman" w:hAnsi="Times New Roman" w:eastAsia="Times New Roman"/>
-          <w:b w:val="0"/>
-          <w:sz w:val="22"/>
+          <w:i w:val="0"/>
+          <w:sz w:val="21"/>
         </w:rPr>
         <w:t>Contract ID, Client Name, Effective Date, Termination Date, Plan Type, Network Name</w:t>
       </w:r>
@@ -477,23 +926,10 @@
         <w:rPr>
           <w:rFonts w:ascii="Times New Roman" w:hAnsi="Times New Roman" w:eastAsia="Times New Roman"/>
           <w:b w:val="0"/>
-          <w:sz w:val="22"/>
+          <w:i w:val="0"/>
+          <w:sz w:val="21"/>
         </w:rPr>
-        <w:t>Coverage Limit, Deductible, Co-pay, Region, Broker, Status</w:t>
-      </w:r>
-    </w:p>
-    <w:p>
-      <w:pPr>
-        <w:spacing w:after="120" w:before="0" w:line="276" w:lineRule="auto"/>
-        <w:jc w:val="both"/>
-      </w:pPr>
-      <w:r>
-        <w:rPr>
-          <w:rFonts w:ascii="Times New Roman" w:hAnsi="Times New Roman" w:eastAsia="Times New Roman"/>
-          <w:b w:val="0"/>
-          <w:sz w:val="22"/>
-        </w:rPr>
-        <w:t>Formats: PDF, DOCX (input); JSON (AI output); Parquet/CSV (curated); XLSX (business template).</w:t>
+        <w:t>Coverage Limit, Deductible, Co-pay, Region, Broker, Status (+ source_format, run_id, validation_status)</w:t>
       </w:r>
     </w:p>
     <w:p>
@@ -504,7 +940,8 @@
         <w:rPr>
           <w:rFonts w:ascii="Times New Roman" w:hAnsi="Times New Roman" w:eastAsia="Times New Roman"/>
           <w:b/>
-          <w:sz w:val="26"/>
+          <w:i w:val="0"/>
+          <w:sz w:val="24"/>
         </w:rPr>
         <w:t>4. Solution Architecture</w:t>
       </w:r>
@@ -518,36 +955,349 @@
         <w:rPr>
           <w:rFonts w:ascii="Times New Roman" w:hAnsi="Times New Roman" w:eastAsia="Times New Roman"/>
           <w:b w:val="0"/>
+          <w:i w:val="0"/>
           <w:sz w:val="22"/>
         </w:rPr>
-        <w:t>Architecture follows a lakehouse-style pipeline using the Hadoop ecosystem, with the existing Gen AI extraction service treated as an external processing step.</w:t>
+        <w:t>The solution follows a medallion / lakehouse pattern. The Gen AI extractor is treated as an external domain service; Hadoop tools own durability, validation, curation, and analytics.</w:t>
       </w:r>
     </w:p>
     <w:p>
       <w:pPr>
-        <w:spacing w:after="80" w:before="0" w:line="276" w:lineRule="auto"/>
+        <w:spacing w:after="100" w:before="0" w:line="276" w:lineRule="auto"/>
         <w:jc w:val="both"/>
       </w:pPr>
       <w:r>
         <w:rPr>
           <w:rFonts w:ascii="Times New Roman" w:hAnsi="Times New Roman" w:eastAsia="Times New Roman"/>
           <w:b w:val="0"/>
+          <w:i w:val="0"/>
           <w:sz w:val="22"/>
         </w:rPr>
-        <w:t>Contracts (PDF/DOCX) → Ingest (Apache Flume / batch put) → HDFS raw zone → Spark preprocessing (metadata, text packaging, schema checks) → AI Extraction Service → HDFS processed zone (JSON) → Spark validation &amp; field mapping → Hive curated tables → Python/code execution fills Excel template → Hive/Spark SQL analytics dashboard queries.</w:t>
+        <w:t>PDF/DOCX contracts  -&gt;  HDFS raw zone (batch put)  -&gt;  AI Extraction (JSON)  -&gt;  HDFS extracted zone  -&gt;  Spark validate &amp; map  -&gt;  HDFS curated (Parquet/CSV) + quarantine  -&gt;  Hive external tables &amp; SQL KPIs  -&gt;  Python Excel template population.</w:t>
       </w:r>
+    </w:p>
+    <w:tbl>
+      <w:tblPr>
+        <w:tblStyle w:val="TableGrid"/>
+        <w:tblW w:type="auto" w:w="0"/>
+        <w:jc w:val="center"/>
+        <w:tblLook w:firstColumn="1" w:firstRow="1" w:lastColumn="0" w:lastRow="0" w:noHBand="0" w:noVBand="1" w:val="04A0"/>
+      </w:tblPr>
+      <w:tblGrid>
+        <w:gridCol w:w="3264"/>
+        <w:gridCol w:w="3264"/>
+        <w:gridCol w:w="3264"/>
+      </w:tblGrid>
+      <w:tr>
+        <w:tc>
+          <w:tcPr>
+            <w:tcW w:type="dxa" w:w="2448"/>
+            <w:shd w:fill="1F4E79"/>
+          </w:tcPr>
+          <w:p>
+            <w:r>
+              <w:rPr>
+                <w:rFonts w:ascii="Times New Roman" w:hAnsi="Times New Roman"/>
+                <w:b/>
+                <w:color w:val="FFFFFF"/>
+                <w:sz w:val="20"/>
+              </w:rPr>
+            </w:r>
+            <w:r>
+              <w:rPr>
+                <w:rFonts w:ascii="Times New Roman" w:hAnsi="Times New Roman" w:eastAsia="Times New Roman"/>
+                <w:b/>
+                <w:i w:val="0"/>
+                <w:color w:val="FFFFFF"/>
+                <w:sz w:val="20"/>
+              </w:rPr>
+              <w:t>Tool</w:t>
+            </w:r>
+          </w:p>
+        </w:tc>
+        <w:tc>
+          <w:tcPr>
+            <w:tcW w:type="dxa" w:w="3600"/>
+            <w:shd w:fill="1F4E79"/>
+          </w:tcPr>
+          <w:p>
+            <w:r>
+              <w:rPr>
+                <w:rFonts w:ascii="Times New Roman" w:hAnsi="Times New Roman"/>
+                <w:b/>
+                <w:color w:val="FFFFFF"/>
+                <w:sz w:val="20"/>
+              </w:rPr>
+            </w:r>
+            <w:r>
+              <w:rPr>
+                <w:rFonts w:ascii="Times New Roman" w:hAnsi="Times New Roman" w:eastAsia="Times New Roman"/>
+                <w:b/>
+                <w:i w:val="0"/>
+                <w:color w:val="FFFFFF"/>
+                <w:sz w:val="20"/>
+              </w:rPr>
+              <w:t>Role in pipeline</w:t>
+            </w:r>
+          </w:p>
+        </w:tc>
+        <w:tc>
+          <w:tcPr>
+            <w:tcW w:type="dxa" w:w="4320"/>
+            <w:shd w:fill="1F4E79"/>
+          </w:tcPr>
+          <w:p>
+            <w:r>
+              <w:rPr>
+                <w:rFonts w:ascii="Times New Roman" w:hAnsi="Times New Roman"/>
+                <w:b/>
+                <w:color w:val="FFFFFF"/>
+                <w:sz w:val="20"/>
+              </w:rPr>
+            </w:r>
+            <w:r>
+              <w:rPr>
+                <w:rFonts w:ascii="Times New Roman" w:hAnsi="Times New Roman" w:eastAsia="Times New Roman"/>
+                <w:b/>
+                <w:i w:val="0"/>
+                <w:color w:val="FFFFFF"/>
+                <w:sz w:val="20"/>
+              </w:rPr>
+              <w:t>PoC artifact</w:t>
+            </w:r>
+          </w:p>
+        </w:tc>
+      </w:tr>
+      <w:tr>
+        <w:tc>
+          <w:tcPr>
+            <w:tcW w:type="dxa" w:w="2448"/>
+          </w:tcPr>
+          <w:p>
+            <w:r/>
+            <w:r>
+              <w:rPr>
+                <w:rFonts w:ascii="Times New Roman" w:hAnsi="Times New Roman" w:eastAsia="Times New Roman"/>
+                <w:b w:val="0"/>
+                <w:i w:val="0"/>
+                <w:sz w:val="20"/>
+              </w:rPr>
+              <w:t>HDFS</w:t>
+            </w:r>
+          </w:p>
+        </w:tc>
+        <w:tc>
+          <w:tcPr>
+            <w:tcW w:type="dxa" w:w="3600"/>
+          </w:tcPr>
+          <w:p>
+            <w:r/>
+            <w:r>
+              <w:rPr>
+                <w:rFonts w:ascii="Times New Roman" w:hAnsi="Times New Roman" w:eastAsia="Times New Roman"/>
+                <w:b w:val="0"/>
+                <w:i w:val="0"/>
+                <w:sz w:val="20"/>
+              </w:rPr>
+              <w:t>Immutable landing + curated/quarantine storage</w:t>
+            </w:r>
+          </w:p>
+        </w:tc>
+        <w:tc>
+          <w:tcPr>
+            <w:tcW w:type="dxa" w:w="4320"/>
+          </w:tcPr>
+          <w:p>
+            <w:r/>
+            <w:r>
+              <w:rPr>
+                <w:rFonts w:ascii="Times New Roman" w:hAnsi="Times New Roman" w:eastAsia="Times New Roman"/>
+                <w:b w:val="0"/>
+                <w:i w:val="0"/>
+                <w:sz w:val="20"/>
+              </w:rPr>
+              <w:t>hdfs dfs -put / ls / du; zones under /user/.../contracts</w:t>
+            </w:r>
+          </w:p>
+        </w:tc>
+      </w:tr>
+      <w:tr>
+        <w:tc>
+          <w:tcPr>
+            <w:tcW w:type="dxa" w:w="2448"/>
+          </w:tcPr>
+          <w:p>
+            <w:r/>
+            <w:r>
+              <w:rPr>
+                <w:rFonts w:ascii="Times New Roman" w:hAnsi="Times New Roman" w:eastAsia="Times New Roman"/>
+                <w:b w:val="0"/>
+                <w:i w:val="0"/>
+                <w:sz w:val="20"/>
+              </w:rPr>
+              <w:t>Apache Spark (YARN)</w:t>
+            </w:r>
+          </w:p>
+        </w:tc>
+        <w:tc>
+          <w:tcPr>
+            <w:tcW w:type="dxa" w:w="3600"/>
+          </w:tcPr>
+          <w:p>
+            <w:r/>
+            <w:r>
+              <w:rPr>
+                <w:rFonts w:ascii="Times New Roman" w:hAnsi="Times New Roman" w:eastAsia="Times New Roman"/>
+                <w:b w:val="0"/>
+                <w:i w:val="0"/>
+                <w:sz w:val="20"/>
+              </w:rPr>
+              <w:t>JSON flatten, required-field validation, metrics</w:t>
+            </w:r>
+          </w:p>
+        </w:tc>
+        <w:tc>
+          <w:tcPr>
+            <w:tcW w:type="dxa" w:w="4320"/>
+          </w:tcPr>
+          <w:p>
+            <w:r/>
+            <w:r>
+              <w:rPr>
+                <w:rFonts w:ascii="Times New Roman" w:hAnsi="Times New Roman" w:eastAsia="Times New Roman"/>
+                <w:b w:val="0"/>
+                <w:i w:val="0"/>
+                <w:sz w:val="20"/>
+              </w:rPr>
+              <w:t>02_spark_validate_map.py; valid=9, invalid=1</w:t>
+            </w:r>
+          </w:p>
+        </w:tc>
+      </w:tr>
+      <w:tr>
+        <w:tc>
+          <w:tcPr>
+            <w:tcW w:type="dxa" w:w="2448"/>
+          </w:tcPr>
+          <w:p>
+            <w:r/>
+            <w:r>
+              <w:rPr>
+                <w:rFonts w:ascii="Times New Roman" w:hAnsi="Times New Roman" w:eastAsia="Times New Roman"/>
+                <w:b w:val="0"/>
+                <w:i w:val="0"/>
+                <w:sz w:val="20"/>
+              </w:rPr>
+              <w:t>Apache Hive</w:t>
+            </w:r>
+          </w:p>
+        </w:tc>
+        <w:tc>
+          <w:tcPr>
+            <w:tcW w:type="dxa" w:w="3600"/>
+          </w:tcPr>
+          <w:p>
+            <w:r/>
+            <w:r>
+              <w:rPr>
+                <w:rFonts w:ascii="Times New Roman" w:hAnsi="Times New Roman" w:eastAsia="Times New Roman"/>
+                <w:b w:val="0"/>
+                <w:i w:val="0"/>
+                <w:sz w:val="20"/>
+              </w:rPr>
+              <w:t>SQL analytics on curated &amp; quarantine tables</w:t>
+            </w:r>
+          </w:p>
+        </w:tc>
+        <w:tc>
+          <w:tcPr>
+            <w:tcW w:type="dxa" w:w="4320"/>
+          </w:tcPr>
+          <w:p>
+            <w:r/>
+            <w:r>
+              <w:rPr>
+                <w:rFonts w:ascii="Times New Roman" w:hAnsi="Times New Roman" w:eastAsia="Times New Roman"/>
+                <w:b w:val="0"/>
+                <w:i w:val="0"/>
+                <w:sz w:val="20"/>
+              </w:rPr>
+              <w:t>COUNT, GROUP BY format/region, quarantine detail</w:t>
+            </w:r>
+          </w:p>
+        </w:tc>
+      </w:tr>
+      <w:tr>
+        <w:tc>
+          <w:tcPr>
+            <w:tcW w:type="dxa" w:w="2448"/>
+          </w:tcPr>
+          <w:p>
+            <w:r/>
+            <w:r>
+              <w:rPr>
+                <w:rFonts w:ascii="Times New Roman" w:hAnsi="Times New Roman" w:eastAsia="Times New Roman"/>
+                <w:b w:val="0"/>
+                <w:i w:val="0"/>
+                <w:sz w:val="20"/>
+              </w:rPr>
+              <w:t>Python (Excel)</w:t>
+            </w:r>
+          </w:p>
+        </w:tc>
+        <w:tc>
+          <w:tcPr>
+            <w:tcW w:type="dxa" w:w="3600"/>
+          </w:tcPr>
+          <w:p>
+            <w:r/>
+            <w:r>
+              <w:rPr>
+                <w:rFonts w:ascii="Times New Roman" w:hAnsi="Times New Roman" w:eastAsia="Times New Roman"/>
+                <w:b w:val="0"/>
+                <w:i w:val="0"/>
+                <w:sz w:val="20"/>
+              </w:rPr>
+              <w:t>Business delivery after Big Data curation</w:t>
+            </w:r>
+          </w:p>
+        </w:tc>
+        <w:tc>
+          <w:tcPr>
+            <w:tcW w:type="dxa" w:w="4320"/>
+          </w:tcPr>
+          <w:p>
+            <w:r/>
+            <w:r>
+              <w:rPr>
+                <w:rFonts w:ascii="Times New Roman" w:hAnsi="Times New Roman" w:eastAsia="Times New Roman"/>
+                <w:b w:val="0"/>
+                <w:i w:val="0"/>
+                <w:sz w:val="20"/>
+              </w:rPr>
+              <w:t>map_json_to_excel.py + filled XLSX</w:t>
+            </w:r>
+          </w:p>
+        </w:tc>
+      </w:tr>
+    </w:tbl>
+    <w:p>
+      <w:pPr>
+        <w:spacing w:after="80"/>
+      </w:pPr>
     </w:p>
     <w:p>
       <w:pPr>
-        <w:spacing w:after="40" w:before="0" w:line="276" w:lineRule="auto"/>
+        <w:spacing w:after="40" w:before="40" w:line="276" w:lineRule="auto"/>
       </w:pPr>
       <w:r>
         <w:rPr>
           <w:rFonts w:ascii="Times New Roman" w:hAnsi="Times New Roman" w:eastAsia="Times New Roman"/>
           <w:b/>
+          <w:i w:val="0"/>
           <w:sz w:val="22"/>
         </w:rPr>
-        <w:t>Tool responsibilities:</w:t>
+        <w:t>Proposed HDFS layout:</w:t>
       </w:r>
     </w:p>
     <w:p>
@@ -559,9 +1309,10 @@
         <w:rPr>
           <w:rFonts w:ascii="Times New Roman" w:hAnsi="Times New Roman" w:eastAsia="Times New Roman"/>
           <w:b w:val="0"/>
-          <w:sz w:val="22"/>
+          <w:i w:val="0"/>
+          <w:sz w:val="21"/>
         </w:rPr>
-        <w:t>HDFS: durable storage for raw contracts, extraction JSON, curated outputs, and run logs.</w:t>
+        <w:t>/user/&lt;id&gt;/situated_learning/contracts/raw/{pdf,docx}</w:t>
       </w:r>
     </w:p>
     <w:p>
@@ -573,9 +1324,10 @@
         <w:rPr>
           <w:rFonts w:ascii="Times New Roman" w:hAnsi="Times New Roman" w:eastAsia="Times New Roman"/>
           <w:b w:val="0"/>
-          <w:sz w:val="22"/>
+          <w:i w:val="0"/>
+          <w:sz w:val="21"/>
         </w:rPr>
-        <w:t>Apache Spark: batch processing, validation rules, field mapping, quality metrics.</w:t>
+        <w:t>/user/&lt;id&gt;/situated_learning/contracts/extracted/json</w:t>
       </w:r>
     </w:p>
     <w:p>
@@ -587,9 +1339,10 @@
         <w:rPr>
           <w:rFonts w:ascii="Times New Roman" w:hAnsi="Times New Roman" w:eastAsia="Times New Roman"/>
           <w:b w:val="0"/>
-          <w:sz w:val="22"/>
+          <w:i w:val="0"/>
+          <w:sz w:val="21"/>
         </w:rPr>
-        <w:t>Apache Hive: SQL over curated extraction results and operational KPIs.</w:t>
+        <w:t>/user/&lt;id&gt;/situated_learning/contracts/curated/{parquet,csv}</w:t>
       </w:r>
     </w:p>
     <w:p>
@@ -601,9 +1354,10 @@
         <w:rPr>
           <w:rFonts w:ascii="Times New Roman" w:hAnsi="Times New Roman" w:eastAsia="Times New Roman"/>
           <w:b w:val="0"/>
-          <w:sz w:val="22"/>
+          <w:i w:val="0"/>
+          <w:sz w:val="21"/>
         </w:rPr>
-        <w:t>Flume (or scripted batch ingest): move files into HDFS landing paths.</w:t>
+        <w:t>/user/&lt;id&gt;/situated_learning/contracts/quarantine</w:t>
       </w:r>
     </w:p>
     <w:p>
@@ -615,92 +1369,10 @@
         <w:rPr>
           <w:rFonts w:ascii="Times New Roman" w:hAnsi="Times New Roman" w:eastAsia="Times New Roman"/>
           <w:b w:val="0"/>
-          <w:sz w:val="22"/>
+          <w:i w:val="0"/>
+          <w:sz w:val="21"/>
         </w:rPr>
-        <w:t>External Gen AI pipeline + Excel writer: domain extraction and template population (existing skill set).</w:t>
-      </w:r>
-    </w:p>
-    <w:p>
-      <w:pPr>
-        <w:spacing w:after="40" w:before="80" w:line="276" w:lineRule="auto"/>
-      </w:pPr>
-      <w:r>
-        <w:rPr>
-          <w:rFonts w:ascii="Times New Roman" w:hAnsi="Times New Roman" w:eastAsia="Times New Roman"/>
-          <w:b/>
-          <w:sz w:val="22"/>
-        </w:rPr>
-        <w:t>HDFS layout (proposed):</w:t>
-      </w:r>
-    </w:p>
-    <w:p>
-      <w:pPr>
-        <w:pStyle w:val="ListBullet"/>
-        <w:spacing w:after="40" w:line="264" w:lineRule="auto"/>
-      </w:pPr>
-      <w:r>
-        <w:rPr>
-          <w:rFonts w:ascii="Times New Roman" w:hAnsi="Times New Roman" w:eastAsia="Times New Roman"/>
-          <w:b w:val="0"/>
-          <w:sz w:val="22"/>
-        </w:rPr>
-        <w:t>/contracts/raw/pdf/ and /contracts/raw/docx/</w:t>
-      </w:r>
-    </w:p>
-    <w:p>
-      <w:pPr>
-        <w:pStyle w:val="ListBullet"/>
-        <w:spacing w:after="40" w:line="264" w:lineRule="auto"/>
-      </w:pPr>
-      <w:r>
-        <w:rPr>
-          <w:rFonts w:ascii="Times New Roman" w:hAnsi="Times New Roman" w:eastAsia="Times New Roman"/>
-          <w:b w:val="0"/>
-          <w:sz w:val="22"/>
-        </w:rPr>
-        <w:t>/contracts/extracted/json/</w:t>
-      </w:r>
-    </w:p>
-    <w:p>
-      <w:pPr>
-        <w:pStyle w:val="ListBullet"/>
-        <w:spacing w:after="40" w:line="264" w:lineRule="auto"/>
-      </w:pPr>
-      <w:r>
-        <w:rPr>
-          <w:rFonts w:ascii="Times New Roman" w:hAnsi="Times New Roman" w:eastAsia="Times New Roman"/>
-          <w:b w:val="0"/>
-          <w:sz w:val="22"/>
-        </w:rPr>
-        <w:t>/contracts/curated/parquet/</w:t>
-      </w:r>
-    </w:p>
-    <w:p>
-      <w:pPr>
-        <w:pStyle w:val="ListBullet"/>
-        <w:spacing w:after="40" w:line="264" w:lineRule="auto"/>
-      </w:pPr>
-      <w:r>
-        <w:rPr>
-          <w:rFonts w:ascii="Times New Roman" w:hAnsi="Times New Roman" w:eastAsia="Times New Roman"/>
-          <w:b w:val="0"/>
-          <w:sz w:val="22"/>
-        </w:rPr>
-        <w:t>/contracts/exports/excel/</w:t>
-      </w:r>
-    </w:p>
-    <w:p>
-      <w:pPr>
-        <w:pStyle w:val="ListBullet"/>
-        <w:spacing w:after="40" w:line="264" w:lineRule="auto"/>
-      </w:pPr>
-      <w:r>
-        <w:rPr>
-          <w:rFonts w:ascii="Times New Roman" w:hAnsi="Times New Roman" w:eastAsia="Times New Roman"/>
-          <w:b w:val="0"/>
-          <w:sz w:val="22"/>
-        </w:rPr>
-        <w:t>/contracts/logs/runs/</w:t>
+        <w:t>/user/&lt;id&gt;/situated_learning/contracts/logs/spark_metrics</w:t>
       </w:r>
     </w:p>
     <w:p>
@@ -711,7 +1383,8 @@
         <w:rPr>
           <w:rFonts w:ascii="Times New Roman" w:hAnsi="Times New Roman" w:eastAsia="Times New Roman"/>
           <w:b/>
-          <w:sz w:val="26"/>
+          <w:i w:val="0"/>
+          <w:sz w:val="24"/>
         </w:rPr>
         <w:t>5. Implementation Plan</w:t>
       </w:r>
@@ -725,9 +1398,10 @@
         <w:rPr>
           <w:rFonts w:ascii="Times New Roman" w:hAnsi="Times New Roman" w:eastAsia="Times New Roman"/>
           <w:b w:val="0"/>
+          <w:i w:val="0"/>
           <w:sz w:val="22"/>
         </w:rPr>
-        <w:t>Data ingestion: Batch land synthetic PDF/DOCX into HDFS raw paths; record file metadata (name, type, size, ingest_ts).</w:t>
+        <w:t>Ingestion: Create HDFS zones and batch-put synthetic PDF/DOCX plus AI JSON into raw/extracted paths; verify with recursive listing and disk-usage summaries.</w:t>
       </w:r>
     </w:p>
     <w:p>
@@ -739,9 +1413,10 @@
         <w:rPr>
           <w:rFonts w:ascii="Times New Roman" w:hAnsi="Times New Roman" w:eastAsia="Times New Roman"/>
           <w:b w:val="0"/>
+          <w:i w:val="0"/>
           <w:sz w:val="22"/>
         </w:rPr>
-        <w:t>Processing workflow: Spark inventories files; AI step produces JSON (simulated or local model for PoC); Spark validates required fields and normalizes dates/amounts; failed records go to a quarantine path.</w:t>
+        <w:t>Processing: Spark reads multi-line JSON from HDFS, flattens nested fields, applies required-field checks, writes VALID rows to curated Parquet/CSV and INVALID rows to quarantine, and emits success-rate metrics.</w:t>
       </w:r>
     </w:p>
     <w:p>
@@ -753,9 +1428,10 @@
         <w:rPr>
           <w:rFonts w:ascii="Times New Roman" w:hAnsi="Times New Roman" w:eastAsia="Times New Roman"/>
           <w:b w:val="0"/>
+          <w:i w:val="0"/>
           <w:sz w:val="22"/>
         </w:rPr>
-        <w:t>Storage strategy: Raw immutability on HDFS; processed JSON versioned by run_id; curated Parquet registered in Hive.</w:t>
+        <w:t>Storage: Keep raw immutable; version processing via run_id; store curated columnar data for Hive; retain quarantine for remediation analytics.</w:t>
       </w:r>
     </w:p>
     <w:p>
@@ -767,9 +1443,10 @@
         <w:rPr>
           <w:rFonts w:ascii="Times New Roman" w:hAnsi="Times New Roman" w:eastAsia="Times New Roman"/>
           <w:b w:val="0"/>
+          <w:i w:val="0"/>
           <w:sz w:val="22"/>
         </w:rPr>
-        <w:t>Analysis methodology: Hive queries for fill-rate per field, contract success rate, PDF vs DOCX error comparison, and daily throughput.</w:t>
+        <w:t>Analysis: Hive external tables over curated/quarantine CSV; queries for totals, PDF vs DOCX mix, region and plan distributions, and quarantine root-cause (e.g., missing broker).</w:t>
       </w:r>
     </w:p>
     <w:p>
@@ -781,9 +1458,10 @@
         <w:rPr>
           <w:rFonts w:ascii="Times New Roman" w:hAnsi="Times New Roman" w:eastAsia="Times New Roman"/>
           <w:b w:val="0"/>
+          <w:i w:val="0"/>
           <w:sz w:val="22"/>
         </w:rPr>
-        <w:t>Excel population: Curated rows mapped column-wise into the template via a small Python script (openpyxl), writing under /contracts/exports/excel/.</w:t>
+        <w:t>Excel delivery: Map curated rows into the business template columns using a Python openpyxl script, preserving the same schema operations teams already use.</w:t>
       </w:r>
     </w:p>
     <w:p>
@@ -794,9 +1472,690 @@
         <w:rPr>
           <w:rFonts w:ascii="Times New Roman" w:hAnsi="Times New Roman" w:eastAsia="Times New Roman"/>
           <w:b/>
-          <w:sz w:val="26"/>
+          <w:i w:val="0"/>
+          <w:sz w:val="24"/>
         </w:rPr>
-        <w:t>6. Proof of Concept Scope</w:t>
+        <w:t>6. Proof of Concept - Scope and Results</w:t>
+      </w:r>
+    </w:p>
+    <w:p>
+      <w:pPr>
+        <w:spacing w:after="80" w:before="0" w:line="276" w:lineRule="auto"/>
+        <w:jc w:val="both"/>
+      </w:pPr>
+      <w:r>
+        <w:rPr>
+          <w:rFonts w:ascii="Times New Roman" w:hAnsi="Times New Roman" w:eastAsia="Times New Roman"/>
+          <w:b w:val="0"/>
+          <w:i w:val="0"/>
+          <w:sz w:val="22"/>
+        </w:rPr>
+        <w:t>The PoC was executed on the course lab cluster (HDFS NameNode + YARN). Only synthetic data was used. Key measured outcomes:</w:t>
+      </w:r>
+    </w:p>
+    <w:tbl>
+      <w:tblPr>
+        <w:tblStyle w:val="TableGrid"/>
+        <w:tblW w:type="auto" w:w="0"/>
+        <w:jc w:val="center"/>
+        <w:tblLook w:firstColumn="1" w:firstRow="1" w:lastColumn="0" w:lastRow="0" w:noHBand="0" w:noVBand="1" w:val="04A0"/>
+      </w:tblPr>
+      <w:tblGrid>
+        <w:gridCol w:w="4896"/>
+        <w:gridCol w:w="4896"/>
+      </w:tblGrid>
+      <w:tr>
+        <w:tc>
+          <w:tcPr>
+            <w:tcW w:type="dxa" w:w="4032"/>
+            <w:shd w:fill="1F4E79"/>
+          </w:tcPr>
+          <w:p>
+            <w:r>
+              <w:rPr>
+                <w:rFonts w:ascii="Times New Roman" w:hAnsi="Times New Roman"/>
+                <w:b/>
+                <w:color w:val="FFFFFF"/>
+                <w:sz w:val="20"/>
+              </w:rPr>
+            </w:r>
+            <w:r>
+              <w:rPr>
+                <w:rFonts w:ascii="Times New Roman" w:hAnsi="Times New Roman" w:eastAsia="Times New Roman"/>
+                <w:b/>
+                <w:i w:val="0"/>
+                <w:color w:val="FFFFFF"/>
+                <w:sz w:val="20"/>
+              </w:rPr>
+              <w:t>Metric</w:t>
+            </w:r>
+          </w:p>
+        </w:tc>
+        <w:tc>
+          <w:tcPr>
+            <w:tcW w:type="dxa" w:w="6048"/>
+            <w:shd w:fill="1F4E79"/>
+          </w:tcPr>
+          <w:p>
+            <w:r>
+              <w:rPr>
+                <w:rFonts w:ascii="Times New Roman" w:hAnsi="Times New Roman"/>
+                <w:b/>
+                <w:color w:val="FFFFFF"/>
+                <w:sz w:val="20"/>
+              </w:rPr>
+            </w:r>
+            <w:r>
+              <w:rPr>
+                <w:rFonts w:ascii="Times New Roman" w:hAnsi="Times New Roman" w:eastAsia="Times New Roman"/>
+                <w:b/>
+                <w:i w:val="0"/>
+                <w:color w:val="FFFFFF"/>
+                <w:sz w:val="20"/>
+              </w:rPr>
+              <w:t>Result</w:t>
+            </w:r>
+          </w:p>
+        </w:tc>
+      </w:tr>
+      <w:tr>
+        <w:tc>
+          <w:tcPr>
+            <w:tcW w:type="dxa" w:w="4032"/>
+          </w:tcPr>
+          <w:p>
+            <w:r/>
+            <w:r>
+              <w:rPr>
+                <w:rFonts w:ascii="Times New Roman" w:hAnsi="Times New Roman" w:eastAsia="Times New Roman"/>
+                <w:b w:val="0"/>
+                <w:i w:val="0"/>
+                <w:sz w:val="20"/>
+              </w:rPr>
+              <w:t>Contracts ingested</w:t>
+            </w:r>
+          </w:p>
+        </w:tc>
+        <w:tc>
+          <w:tcPr>
+            <w:tcW w:type="dxa" w:w="6048"/>
+          </w:tcPr>
+          <w:p>
+            <w:r/>
+            <w:r>
+              <w:rPr>
+                <w:rFonts w:ascii="Times New Roman" w:hAnsi="Times New Roman" w:eastAsia="Times New Roman"/>
+                <w:b w:val="0"/>
+                <w:i w:val="0"/>
+                <w:sz w:val="20"/>
+              </w:rPr>
+              <w:t>10 (5 PDF + 5 DOCX)</w:t>
+            </w:r>
+          </w:p>
+        </w:tc>
+      </w:tr>
+      <w:tr>
+        <w:tc>
+          <w:tcPr>
+            <w:tcW w:type="dxa" w:w="4032"/>
+          </w:tcPr>
+          <w:p>
+            <w:r/>
+            <w:r>
+              <w:rPr>
+                <w:rFonts w:ascii="Times New Roman" w:hAnsi="Times New Roman" w:eastAsia="Times New Roman"/>
+                <w:b w:val="0"/>
+                <w:i w:val="0"/>
+                <w:sz w:val="20"/>
+              </w:rPr>
+              <w:t>Spark VALID records</w:t>
+            </w:r>
+          </w:p>
+        </w:tc>
+        <w:tc>
+          <w:tcPr>
+            <w:tcW w:type="dxa" w:w="6048"/>
+          </w:tcPr>
+          <w:p>
+            <w:r/>
+            <w:r>
+              <w:rPr>
+                <w:rFonts w:ascii="Times New Roman" w:hAnsi="Times New Roman" w:eastAsia="Times New Roman"/>
+                <w:b w:val="0"/>
+                <w:i w:val="0"/>
+                <w:sz w:val="20"/>
+              </w:rPr>
+              <w:t>9</w:t>
+            </w:r>
+          </w:p>
+        </w:tc>
+      </w:tr>
+      <w:tr>
+        <w:tc>
+          <w:tcPr>
+            <w:tcW w:type="dxa" w:w="4032"/>
+          </w:tcPr>
+          <w:p>
+            <w:r/>
+            <w:r>
+              <w:rPr>
+                <w:rFonts w:ascii="Times New Roman" w:hAnsi="Times New Roman" w:eastAsia="Times New Roman"/>
+                <w:b w:val="0"/>
+                <w:i w:val="0"/>
+                <w:sz w:val="20"/>
+              </w:rPr>
+              <w:t>Spark INVALID / quarantine</w:t>
+            </w:r>
+          </w:p>
+        </w:tc>
+        <w:tc>
+          <w:tcPr>
+            <w:tcW w:type="dxa" w:w="6048"/>
+          </w:tcPr>
+          <w:p>
+            <w:r/>
+            <w:r>
+              <w:rPr>
+                <w:rFonts w:ascii="Times New Roman" w:hAnsi="Times New Roman" w:eastAsia="Times New Roman"/>
+                <w:b w:val="0"/>
+                <w:i w:val="0"/>
+                <w:sz w:val="20"/>
+              </w:rPr>
+              <w:t>1 (SYN-2024-008, missing broker)</w:t>
+            </w:r>
+          </w:p>
+        </w:tc>
+      </w:tr>
+      <w:tr>
+        <w:tc>
+          <w:tcPr>
+            <w:tcW w:type="dxa" w:w="4032"/>
+          </w:tcPr>
+          <w:p>
+            <w:r/>
+            <w:r>
+              <w:rPr>
+                <w:rFonts w:ascii="Times New Roman" w:hAnsi="Times New Roman" w:eastAsia="Times New Roman"/>
+                <w:b w:val="0"/>
+                <w:i w:val="0"/>
+                <w:sz w:val="20"/>
+              </w:rPr>
+              <w:t>Success rate</w:t>
+            </w:r>
+          </w:p>
+        </w:tc>
+        <w:tc>
+          <w:tcPr>
+            <w:tcW w:type="dxa" w:w="6048"/>
+          </w:tcPr>
+          <w:p>
+            <w:r/>
+            <w:r>
+              <w:rPr>
+                <w:rFonts w:ascii="Times New Roman" w:hAnsi="Times New Roman" w:eastAsia="Times New Roman"/>
+                <w:b w:val="0"/>
+                <w:i w:val="0"/>
+                <w:sz w:val="20"/>
+              </w:rPr>
+              <w:t>90%</w:t>
+            </w:r>
+          </w:p>
+        </w:tc>
+      </w:tr>
+      <w:tr>
+        <w:tc>
+          <w:tcPr>
+            <w:tcW w:type="dxa" w:w="4032"/>
+          </w:tcPr>
+          <w:p>
+            <w:r/>
+            <w:r>
+              <w:rPr>
+                <w:rFonts w:ascii="Times New Roman" w:hAnsi="Times New Roman" w:eastAsia="Times New Roman"/>
+                <w:b w:val="0"/>
+                <w:i w:val="0"/>
+                <w:sz w:val="20"/>
+              </w:rPr>
+              <w:t>Hadoop tools demonstrated</w:t>
+            </w:r>
+          </w:p>
+        </w:tc>
+        <w:tc>
+          <w:tcPr>
+            <w:tcW w:type="dxa" w:w="6048"/>
+          </w:tcPr>
+          <w:p>
+            <w:r/>
+            <w:r>
+              <w:rPr>
+                <w:rFonts w:ascii="Times New Roman" w:hAnsi="Times New Roman" w:eastAsia="Times New Roman"/>
+                <w:b w:val="0"/>
+                <w:i w:val="0"/>
+                <w:sz w:val="20"/>
+              </w:rPr>
+              <w:t>HDFS + Spark + Hive (3+)</w:t>
+            </w:r>
+          </w:p>
+        </w:tc>
+      </w:tr>
+      <w:tr>
+        <w:tc>
+          <w:tcPr>
+            <w:tcW w:type="dxa" w:w="4032"/>
+          </w:tcPr>
+          <w:p>
+            <w:r/>
+            <w:r>
+              <w:rPr>
+                <w:rFonts w:ascii="Times New Roman" w:hAnsi="Times New Roman" w:eastAsia="Times New Roman"/>
+                <w:b w:val="0"/>
+                <w:i w:val="0"/>
+                <w:sz w:val="20"/>
+              </w:rPr>
+              <w:t>Evidence captured</w:t>
+            </w:r>
+          </w:p>
+        </w:tc>
+        <w:tc>
+          <w:tcPr>
+            <w:tcW w:type="dxa" w:w="6048"/>
+          </w:tcPr>
+          <w:p>
+            <w:r/>
+            <w:r>
+              <w:rPr>
+                <w:rFonts w:ascii="Times New Roman" w:hAnsi="Times New Roman" w:eastAsia="Times New Roman"/>
+                <w:b w:val="0"/>
+                <w:i w:val="0"/>
+                <w:sz w:val="20"/>
+              </w:rPr>
+              <w:t>Lab screenshots of HDFS, Spark, and Hive outputs</w:t>
+            </w:r>
+          </w:p>
+        </w:tc>
+      </w:tr>
+    </w:tbl>
+    <w:p>
+      <w:pPr>
+        <w:spacing w:after="80"/>
+      </w:pPr>
+    </w:p>
+    <w:p>
+      <w:pPr>
+        <w:spacing w:after="120" w:before="0" w:line="276" w:lineRule="auto"/>
+        <w:jc w:val="both"/>
+      </w:pPr>
+      <w:r>
+        <w:rPr>
+          <w:rFonts w:ascii="Times New Roman" w:hAnsi="Times New Roman" w:eastAsia="Times New Roman"/>
+          <w:b w:val="0"/>
+          <w:i w:val="0"/>
+          <w:sz w:val="22"/>
+        </w:rPr>
+        <w:t>These results demonstrate not only happy-path extraction mapping, but also controlled failure handling - a critical production requirement when Gen AI returns partial fields.</w:t>
+      </w:r>
+    </w:p>
+    <w:p>
+      <w:pPr>
+        <w:spacing w:after="80" w:before="200" w:line="276" w:lineRule="auto"/>
+      </w:pPr>
+      <w:r>
+        <w:rPr>
+          <w:rFonts w:ascii="Times New Roman" w:hAnsi="Times New Roman" w:eastAsia="Times New Roman"/>
+          <w:b/>
+          <w:i w:val="0"/>
+          <w:sz w:val="24"/>
+        </w:rPr>
+        <w:t>7. Implementation Timeline</w:t>
+      </w:r>
+    </w:p>
+    <w:tbl>
+      <w:tblPr>
+        <w:tblStyle w:val="TableGrid"/>
+        <w:tblW w:type="auto" w:w="0"/>
+        <w:jc w:val="center"/>
+        <w:tblLook w:firstColumn="1" w:firstRow="1" w:lastColumn="0" w:lastRow="0" w:noHBand="0" w:noVBand="1" w:val="04A0"/>
+      </w:tblPr>
+      <w:tblGrid>
+        <w:gridCol w:w="2448"/>
+        <w:gridCol w:w="2448"/>
+        <w:gridCol w:w="2448"/>
+        <w:gridCol w:w="2448"/>
+      </w:tblGrid>
+      <w:tr>
+        <w:tc>
+          <w:tcPr>
+            <w:tcW w:type="dxa" w:w="2160"/>
+            <w:shd w:fill="1F4E79"/>
+          </w:tcPr>
+          <w:p>
+            <w:r>
+              <w:rPr>
+                <w:rFonts w:ascii="Times New Roman" w:hAnsi="Times New Roman"/>
+                <w:b/>
+                <w:color w:val="FFFFFF"/>
+                <w:sz w:val="20"/>
+              </w:rPr>
+            </w:r>
+            <w:r>
+              <w:rPr>
+                <w:rFonts w:ascii="Times New Roman" w:hAnsi="Times New Roman" w:eastAsia="Times New Roman"/>
+                <w:b/>
+                <w:i w:val="0"/>
+                <w:color w:val="FFFFFF"/>
+                <w:sz w:val="20"/>
+              </w:rPr>
+              <w:t>Phase</w:t>
+            </w:r>
+          </w:p>
+        </w:tc>
+        <w:tc>
+          <w:tcPr>
+            <w:tcW w:type="dxa" w:w="2160"/>
+            <w:shd w:fill="1F4E79"/>
+          </w:tcPr>
+          <w:p>
+            <w:r>
+              <w:rPr>
+                <w:rFonts w:ascii="Times New Roman" w:hAnsi="Times New Roman"/>
+                <w:b/>
+                <w:color w:val="FFFFFF"/>
+                <w:sz w:val="20"/>
+              </w:rPr>
+            </w:r>
+            <w:r>
+              <w:rPr>
+                <w:rFonts w:ascii="Times New Roman" w:hAnsi="Times New Roman" w:eastAsia="Times New Roman"/>
+                <w:b/>
+                <w:i w:val="0"/>
+                <w:color w:val="FFFFFF"/>
+                <w:sz w:val="20"/>
+              </w:rPr>
+              <w:t>Window</w:t>
+            </w:r>
+          </w:p>
+        </w:tc>
+        <w:tc>
+          <w:tcPr>
+            <w:tcW w:type="dxa" w:w="4320"/>
+            <w:shd w:fill="1F4E79"/>
+          </w:tcPr>
+          <w:p>
+            <w:r>
+              <w:rPr>
+                <w:rFonts w:ascii="Times New Roman" w:hAnsi="Times New Roman"/>
+                <w:b/>
+                <w:color w:val="FFFFFF"/>
+                <w:sz w:val="20"/>
+              </w:rPr>
+            </w:r>
+            <w:r>
+              <w:rPr>
+                <w:rFonts w:ascii="Times New Roman" w:hAnsi="Times New Roman" w:eastAsia="Times New Roman"/>
+                <w:b/>
+                <w:i w:val="0"/>
+                <w:color w:val="FFFFFF"/>
+                <w:sz w:val="20"/>
+              </w:rPr>
+              <w:t>Activities</w:t>
+            </w:r>
+          </w:p>
+        </w:tc>
+        <w:tc>
+          <w:tcPr>
+            <w:tcW w:type="dxa" w:w="1728"/>
+            <w:shd w:fill="1F4E79"/>
+          </w:tcPr>
+          <w:p>
+            <w:r>
+              <w:rPr>
+                <w:rFonts w:ascii="Times New Roman" w:hAnsi="Times New Roman"/>
+                <w:b/>
+                <w:color w:val="FFFFFF"/>
+                <w:sz w:val="20"/>
+              </w:rPr>
+            </w:r>
+            <w:r>
+              <w:rPr>
+                <w:rFonts w:ascii="Times New Roman" w:hAnsi="Times New Roman" w:eastAsia="Times New Roman"/>
+                <w:b/>
+                <w:i w:val="0"/>
+                <w:color w:val="FFFFFF"/>
+                <w:sz w:val="20"/>
+              </w:rPr>
+              <w:t>Status</w:t>
+            </w:r>
+          </w:p>
+        </w:tc>
+      </w:tr>
+      <w:tr>
+        <w:tc>
+          <w:tcPr>
+            <w:tcW w:type="dxa" w:w="2160"/>
+          </w:tcPr>
+          <w:p>
+            <w:r/>
+            <w:r>
+              <w:rPr>
+                <w:rFonts w:ascii="Times New Roman" w:hAnsi="Times New Roman" w:eastAsia="Times New Roman"/>
+                <w:b w:val="0"/>
+                <w:i w:val="0"/>
+                <w:sz w:val="20"/>
+              </w:rPr>
+              <w:t>1. Design &amp; data</w:t>
+            </w:r>
+          </w:p>
+        </w:tc>
+        <w:tc>
+          <w:tcPr>
+            <w:tcW w:type="dxa" w:w="2160"/>
+          </w:tcPr>
+          <w:p>
+            <w:r/>
+            <w:r>
+              <w:rPr>
+                <w:rFonts w:ascii="Times New Roman" w:hAnsi="Times New Roman" w:eastAsia="Times New Roman"/>
+                <w:b w:val="0"/>
+                <w:i w:val="0"/>
+                <w:sz w:val="20"/>
+              </w:rPr>
+              <w:t>By 27 Jul 2026</w:t>
+            </w:r>
+          </w:p>
+        </w:tc>
+        <w:tc>
+          <w:tcPr>
+            <w:tcW w:type="dxa" w:w="4320"/>
+          </w:tcPr>
+          <w:p>
+            <w:r/>
+            <w:r>
+              <w:rPr>
+                <w:rFonts w:ascii="Times New Roman" w:hAnsi="Times New Roman" w:eastAsia="Times New Roman"/>
+                <w:b w:val="0"/>
+                <w:i w:val="0"/>
+                <w:sz w:val="20"/>
+              </w:rPr>
+              <w:t>Schema, synthetic PDF/DOCX/JSON, proposal draft</w:t>
+            </w:r>
+          </w:p>
+        </w:tc>
+        <w:tc>
+          <w:tcPr>
+            <w:tcW w:type="dxa" w:w="1728"/>
+          </w:tcPr>
+          <w:p>
+            <w:r/>
+            <w:r>
+              <w:rPr>
+                <w:rFonts w:ascii="Times New Roman" w:hAnsi="Times New Roman" w:eastAsia="Times New Roman"/>
+                <w:b w:val="0"/>
+                <w:i w:val="0"/>
+                <w:sz w:val="20"/>
+              </w:rPr>
+              <w:t>Completed</w:t>
+            </w:r>
+          </w:p>
+        </w:tc>
+      </w:tr>
+      <w:tr>
+        <w:tc>
+          <w:tcPr>
+            <w:tcW w:type="dxa" w:w="2160"/>
+          </w:tcPr>
+          <w:p>
+            <w:r/>
+            <w:r>
+              <w:rPr>
+                <w:rFonts w:ascii="Times New Roman" w:hAnsi="Times New Roman" w:eastAsia="Times New Roman"/>
+                <w:b w:val="0"/>
+                <w:i w:val="0"/>
+                <w:sz w:val="20"/>
+              </w:rPr>
+              <w:t>2. Cluster PoC</w:t>
+            </w:r>
+          </w:p>
+        </w:tc>
+        <w:tc>
+          <w:tcPr>
+            <w:tcW w:type="dxa" w:w="2160"/>
+          </w:tcPr>
+          <w:p>
+            <w:r/>
+            <w:r>
+              <w:rPr>
+                <w:rFonts w:ascii="Times New Roman" w:hAnsi="Times New Roman" w:eastAsia="Times New Roman"/>
+                <w:b w:val="0"/>
+                <w:i w:val="0"/>
+                <w:sz w:val="20"/>
+              </w:rPr>
+              <w:t>By 3 Aug 2026</w:t>
+            </w:r>
+          </w:p>
+        </w:tc>
+        <w:tc>
+          <w:tcPr>
+            <w:tcW w:type="dxa" w:w="4320"/>
+          </w:tcPr>
+          <w:p>
+            <w:r/>
+            <w:r>
+              <w:rPr>
+                <w:rFonts w:ascii="Times New Roman" w:hAnsi="Times New Roman" w:eastAsia="Times New Roman"/>
+                <w:b w:val="0"/>
+                <w:i w:val="0"/>
+                <w:sz w:val="20"/>
+              </w:rPr>
+              <w:t>HDFS ingest, Spark validate/map, Hive queries, Excel export</w:t>
+            </w:r>
+          </w:p>
+        </w:tc>
+        <w:tc>
+          <w:tcPr>
+            <w:tcW w:type="dxa" w:w="1728"/>
+          </w:tcPr>
+          <w:p>
+            <w:r/>
+            <w:r>
+              <w:rPr>
+                <w:rFonts w:ascii="Times New Roman" w:hAnsi="Times New Roman" w:eastAsia="Times New Roman"/>
+                <w:b w:val="0"/>
+                <w:i w:val="0"/>
+                <w:sz w:val="20"/>
+              </w:rPr>
+              <w:t>Completed</w:t>
+            </w:r>
+          </w:p>
+        </w:tc>
+      </w:tr>
+      <w:tr>
+        <w:tc>
+          <w:tcPr>
+            <w:tcW w:type="dxa" w:w="2160"/>
+          </w:tcPr>
+          <w:p>
+            <w:r/>
+            <w:r>
+              <w:rPr>
+                <w:rFonts w:ascii="Times New Roman" w:hAnsi="Times New Roman" w:eastAsia="Times New Roman"/>
+                <w:b w:val="0"/>
+                <w:i w:val="0"/>
+                <w:sz w:val="20"/>
+              </w:rPr>
+              <w:t>3. Evidence &amp; submit</w:t>
+            </w:r>
+          </w:p>
+        </w:tc>
+        <w:tc>
+          <w:tcPr>
+            <w:tcW w:type="dxa" w:w="2160"/>
+          </w:tcPr>
+          <w:p>
+            <w:r/>
+            <w:r>
+              <w:rPr>
+                <w:rFonts w:ascii="Times New Roman" w:hAnsi="Times New Roman" w:eastAsia="Times New Roman"/>
+                <w:b w:val="0"/>
+                <w:i w:val="0"/>
+                <w:sz w:val="20"/>
+              </w:rPr>
+              <w:t>By 6 Aug 2026</w:t>
+            </w:r>
+          </w:p>
+        </w:tc>
+        <w:tc>
+          <w:tcPr>
+            <w:tcW w:type="dxa" w:w="4320"/>
+          </w:tcPr>
+          <w:p>
+            <w:r/>
+            <w:r>
+              <w:rPr>
+                <w:rFonts w:ascii="Times New Roman" w:hAnsi="Times New Roman" w:eastAsia="Times New Roman"/>
+                <w:b w:val="0"/>
+                <w:i w:val="0"/>
+                <w:sz w:val="20"/>
+              </w:rPr>
+              <w:t>Screenshots, presentation, Taxila PDF submission</w:t>
+            </w:r>
+          </w:p>
+        </w:tc>
+        <w:tc>
+          <w:tcPr>
+            <w:tcW w:type="dxa" w:w="1728"/>
+          </w:tcPr>
+          <w:p>
+            <w:r/>
+            <w:r>
+              <w:rPr>
+                <w:rFonts w:ascii="Times New Roman" w:hAnsi="Times New Roman" w:eastAsia="Times New Roman"/>
+                <w:b w:val="0"/>
+                <w:i w:val="0"/>
+                <w:sz w:val="20"/>
+              </w:rPr>
+              <w:t>In progress</w:t>
+            </w:r>
+          </w:p>
+        </w:tc>
+      </w:tr>
+    </w:tbl>
+    <w:p>
+      <w:pPr>
+        <w:spacing w:after="80"/>
+      </w:pPr>
+    </w:p>
+    <w:p>
+      <w:pPr>
+        <w:spacing w:after="80" w:before="200" w:line="276" w:lineRule="auto"/>
+      </w:pPr>
+      <w:r>
+        <w:rPr>
+          <w:rFonts w:ascii="Times New Roman" w:hAnsi="Times New Roman" w:eastAsia="Times New Roman"/>
+          <w:b/>
+          <w:i w:val="0"/>
+          <w:sz w:val="24"/>
+        </w:rPr>
+        <w:t>8. Risks, Mitigation, and Evaluation Fit</w:t>
       </w:r>
     </w:p>
     <w:p>
@@ -808,9 +2167,10 @@
         <w:rPr>
           <w:rFonts w:ascii="Times New Roman" w:hAnsi="Times New Roman" w:eastAsia="Times New Roman"/>
           <w:b w:val="0"/>
-          <w:sz w:val="22"/>
+          <w:i w:val="0"/>
+          <w:sz w:val="21"/>
         </w:rPr>
-        <w:t>Use only synthetic PDF/DOCX + synthetic extraction JSON (no client originals).</w:t>
+        <w:t>Confidentiality risk -&gt; mitigated by synthetic-only PoC data; no client originals.</w:t>
       </w:r>
     </w:p>
     <w:p>
@@ -822,9 +2182,10 @@
         <w:rPr>
           <w:rFonts w:ascii="Times New Roman" w:hAnsi="Times New Roman" w:eastAsia="Times New Roman"/>
           <w:b w:val="0"/>
-          <w:sz w:val="22"/>
+          <w:i w:val="0"/>
+          <w:sz w:val="21"/>
         </w:rPr>
-        <w:t>Demonstrate HDFS + Spark + Hive (minimum three Hadoop tools).</w:t>
+        <w:t>Lab MapReduce instability on complex Hive ORDER BY/UNION -&gt; mitigated with simpler SQL still proving analytics.</w:t>
       </w:r>
     </w:p>
     <w:p>
@@ -836,9 +2197,10 @@
         <w:rPr>
           <w:rFonts w:ascii="Times New Roman" w:hAnsi="Times New Roman" w:eastAsia="Times New Roman"/>
           <w:b w:val="0"/>
-          <w:sz w:val="22"/>
+          <w:i w:val="0"/>
+          <w:sz w:val="21"/>
         </w:rPr>
-        <w:t>Produce at least one filled Excel template and KPI query outputs.</w:t>
+        <w:t>Spark defaulting to local file:// paths -&gt; mitigated by explicit hdfs://namenode URIs and HADOOP_CONF_DIR.</w:t>
       </w:r>
     </w:p>
     <w:p>
@@ -850,9 +2212,10 @@
         <w:rPr>
           <w:rFonts w:ascii="Times New Roman" w:hAnsi="Times New Roman" w:eastAsia="Times New Roman"/>
           <w:b w:val="0"/>
-          <w:sz w:val="22"/>
+          <w:i w:val="0"/>
+          <w:sz w:val="21"/>
         </w:rPr>
-        <w:t>Capture screenshots of HDFS listings, Spark job output, Hive results, and Excel sample.</w:t>
+        <w:t>Assignment fit: Problem Identification (business+3Vs), Solution Design (architecture+plan), PoC (3 tools+results).</w:t>
       </w:r>
     </w:p>
     <w:p>
@@ -863,64 +2226,10 @@
         <w:rPr>
           <w:rFonts w:ascii="Times New Roman" w:hAnsi="Times New Roman" w:eastAsia="Times New Roman"/>
           <w:b/>
-          <w:sz w:val="26"/>
+          <w:i w:val="0"/>
+          <w:sz w:val="24"/>
         </w:rPr>
-        <w:t>7. Implementation Timeline</w:t>
-      </w:r>
-    </w:p>
-    <w:p>
-      <w:pPr>
-        <w:pStyle w:val="ListBullet"/>
-        <w:spacing w:after="40" w:line="264" w:lineRule="auto"/>
-      </w:pPr>
-      <w:r>
-        <w:rPr>
-          <w:rFonts w:ascii="Times New Roman" w:hAnsi="Times New Roman" w:eastAsia="Times New Roman"/>
-          <w:b w:val="0"/>
-          <w:sz w:val="22"/>
-        </w:rPr>
-        <w:t>Week 1 (by 27 Jul 2026): Finalize schema, create synthetic contracts, set up HDFS folders.</w:t>
-      </w:r>
-    </w:p>
-    <w:p>
-      <w:pPr>
-        <w:pStyle w:val="ListBullet"/>
-        <w:spacing w:after="40" w:line="264" w:lineRule="auto"/>
-      </w:pPr>
-      <w:r>
-        <w:rPr>
-          <w:rFonts w:ascii="Times New Roman" w:hAnsi="Times New Roman" w:eastAsia="Times New Roman"/>
-          <w:b w:val="0"/>
-          <w:sz w:val="22"/>
-        </w:rPr>
-        <w:t>Week 2 (by 3 Aug 2026): Spark validation/mapping job + Hive tables + Excel export script.</w:t>
-      </w:r>
-    </w:p>
-    <w:p>
-      <w:pPr>
-        <w:pStyle w:val="ListBullet"/>
-        <w:spacing w:after="40" w:line="264" w:lineRule="auto"/>
-      </w:pPr>
-      <w:r>
-        <w:rPr>
-          <w:rFonts w:ascii="Times New Roman" w:hAnsi="Times New Roman" w:eastAsia="Times New Roman"/>
-          <w:b w:val="0"/>
-          <w:sz w:val="22"/>
-        </w:rPr>
-        <w:t>Week 3 (by 6 Aug 2026): Screenshots, proposal polish, 5–7 slide presentation, Taxila submission.</w:t>
-      </w:r>
-    </w:p>
-    <w:p>
-      <w:pPr>
-        <w:spacing w:after="80" w:before="200" w:line="276" w:lineRule="auto"/>
-      </w:pPr>
-      <w:r>
-        <w:rPr>
-          <w:rFonts w:ascii="Times New Roman" w:hAnsi="Times New Roman" w:eastAsia="Times New Roman"/>
-          <w:b/>
-          <w:sz w:val="26"/>
-        </w:rPr>
-        <w:t>8. Business Impact and Future Scope</w:t>
+        <w:t>9. Business Impact and Future Scope</w:t>
       </w:r>
     </w:p>
     <w:p>
@@ -932,9 +2241,10 @@
         <w:rPr>
           <w:rFonts w:ascii="Times New Roman" w:hAnsi="Times New Roman" w:eastAsia="Times New Roman"/>
           <w:b w:val="0"/>
+          <w:i w:val="0"/>
           <w:sz w:val="22"/>
         </w:rPr>
-        <w:t>A Big Data backbone around the Gen AI contract pipeline improves reprocessing, auditability, and quality visibility while keeping Excel as the business-friendly delivery format. Future work can add Kafka for near-real-time ingest, HBase for low-latency lookup by Contract ID, and automated drift alerts when field fill-rates drop.</w:t>
+        <w:t>Wrapping Gen AI contract extraction with HDFS durability, Spark validation, and Hive observability improves auditability, reprocessing safety, and quality visibility while preserving Excel as the business delivery format. Near-term extensions include Kafka/NiFi for near-real-time ingest, HBase keyed lookup by Contract ID, automated drift alerts when field fill-rates drop, and stronger OCR pre-processing for scanned PDFs.</w:t>
       </w:r>
     </w:p>
     <w:p>
@@ -945,9 +2255,10 @@
         <w:rPr>
           <w:rFonts w:ascii="Times New Roman" w:hAnsi="Times New Roman" w:eastAsia="Times New Roman"/>
           <w:b w:val="0"/>
+          <w:i/>
           <w:sz w:val="20"/>
         </w:rPr>
-        <w:t>Declaration: This proposal reflects original thinking based on my work environment. PoC data will be synthetic and non-confidential.</w:t>
+        <w:t>Declaration: This proposal reflects original thinking derived from my work environment. All PoC datasets are synthetic and non-confidential.</w:t>
       </w:r>
     </w:p>
     <w:p>
@@ -958,14 +2269,15 @@
         <w:rPr>
           <w:rFonts w:ascii="Times New Roman" w:hAnsi="Times New Roman" w:eastAsia="Times New Roman"/>
           <w:b/>
+          <w:i w:val="0"/>
           <w:sz w:val="20"/>
         </w:rPr>
-        <w:t>Student: DEVATA SAI HARSHITH | BITS ID: 2024DC04035</w:t>
+        <w:t>Student: DEVATA SAI HARSHITH  |  BITS ID: 2024DC04035</w:t>
       </w:r>
     </w:p>
     <w:sectPr>
       <w:pgSz w:w="12240" w:h="15840"/>
-      <w:pgMar w:top="1152" w:right="1296" w:bottom="1152" w:left="1296" w:header="720" w:footer="720" w:gutter="0"/>
+      <w:pgMar w:top="1008" w:right="1224" w:bottom="1008" w:left="1224" w:header="720" w:footer="720" w:gutter="0"/>
       <w:cols w:space="720"/>
       <w:docGrid w:linePitch="360"/>
     </w:sectPr>

</xml_diff>